<commit_message>
Pipeline completo na base de IA: texto domina recall em rede esparsa
final_comparison.py: flag t0active (avalia só autores ativos em T0; oráculo
rápido) + WORKS_RAW env. GNN treinada na base IA; comparação dos 7 modelos
(T0-ativos n=2003). Resultado: na rede esparsa de IA, Texto e Cand. híbridos
dominam o recall@200 (warm 6,8 / cool 7,6) e SUPERAM o oráculo topológico (6,6/5,9);
RF/GNN só lideram no topo (R@10). Inverte a base médica (densa, RF vencia) →
o valor do multimodal cresce com a esparsidade da rede. Dashboard, gráficos,
tabela e relatório .docx regenerados p/ base IA.

Co-Authored-By: Claude Opus 4.8 <noreply@anthropic.com>
</commit_message>
<xml_diff>
--- a/docs/RELATORIO_AVALIACAO.docx
+++ b/docs/RELATORIO_AVALIACAO.docx
@@ -741,19 +741,19 @@
         <w:pStyle w:val="Heading1"/>
       </w:pPr>
       <w:r>
-        <w:t xml:space="preserve">3. Comparação com o baseline (base médica, geral)</w:t>
-      </w:r>
-    </w:p>
-    <w:p>
-      <w:r>
-        <w:t xml:space="preserve">Δ vs Baseline = ganho/perda em Recall@200 sobre o Common Neighbors. </w:t>
+        <w:t xml:space="preserve">3. Comparação com o baseline (base de IA, autores ativos em T0)</w:t>
+      </w:r>
+    </w:p>
+    <w:p>
+      <w:r>
+        <w:t xml:space="preserve">Δ vs Baseline = ganho/perda em Recall@200 sobre o Common Neighbors, na base de IA. </w:t>
       </w:r>
       <w:r>
         <w:rPr>
           <w:i/>
           <w:iCs/>
         </w:rPr>
-        <w:t xml:space="preserve">Verde = ganho; vermelho = perda. Oráculo é o teto (não é modelo operacional).</w:t>
+        <w:t xml:space="preserve">Verde = ganho; vermelho = perda. Oráculo é o teto topológico (não é modelo operacional).</w:t>
       </w:r>
     </w:p>
     <w:tbl>
@@ -996,7 +996,7 @@
                 <w:sz w:val="18"/>
                 <w:szCs w:val="18"/>
               </w:rPr>
-              <w:t xml:space="preserve">13.23</w:t>
+              <w:t xml:space="preserve">1.29</w:t>
             </w:r>
           </w:p>
         </w:tc>
@@ -1060,7 +1060,7 @@
                 <w:sz w:val="18"/>
                 <w:szCs w:val="18"/>
               </w:rPr>
-              <w:t xml:space="preserve">14.35</w:t>
+              <w:t xml:space="preserve">2.67</w:t>
             </w:r>
           </w:p>
         </w:tc>
@@ -1092,7 +1092,7 @@
                 <w:sz w:val="18"/>
                 <w:szCs w:val="18"/>
               </w:rPr>
-              <w:t xml:space="preserve">5.43</w:t>
+              <w:t xml:space="preserve">1.15</w:t>
             </w:r>
           </w:p>
         </w:tc>
@@ -1160,7 +1160,7 @@
                 <w:sz w:val="18"/>
                 <w:szCs w:val="18"/>
               </w:rPr>
-              <w:t xml:space="preserve">14.80</w:t>
+              <w:t xml:space="preserve">3.74</w:t>
             </w:r>
           </w:p>
         </w:tc>
@@ -1193,7 +1193,7 @@
                 <w:sz w:val="18"/>
                 <w:szCs w:val="18"/>
               </w:rPr>
-              <w:t xml:space="preserve">+1.58</w:t>
+              <w:t xml:space="preserve">+2.45</w:t>
             </w:r>
           </w:p>
         </w:tc>
@@ -1226,7 +1226,7 @@
                 <w:sz w:val="18"/>
                 <w:szCs w:val="18"/>
               </w:rPr>
-              <w:t xml:space="preserve">13.10</w:t>
+              <w:t xml:space="preserve">4.23</w:t>
             </w:r>
           </w:p>
         </w:tc>
@@ -1259,7 +1259,7 @@
                 <w:sz w:val="18"/>
                 <w:szCs w:val="18"/>
               </w:rPr>
-              <w:t xml:space="preserve">5.23</w:t>
+              <w:t xml:space="preserve">2.24</w:t>
             </w:r>
           </w:p>
         </w:tc>
@@ -1325,7 +1325,7 @@
                 <w:sz w:val="18"/>
                 <w:szCs w:val="18"/>
               </w:rPr>
-              <w:t xml:space="preserve">2.22</w:t>
+              <w:t xml:space="preserve">6.81</w:t>
             </w:r>
           </w:p>
         </w:tc>
@@ -1338,7 +1338,7 @@
               <w:bottom w:val="single" w:color="BBBBBB" w:sz="1"/>
               <w:right w:val="single" w:color="BBBBBB" w:sz="1"/>
             </w:tcBorders>
-            <w:shd w:fill="F8D7DA" w:val="clear"/>
+            <w:shd w:fill="DDEBD8" w:val="clear"/>
             <w:tcMar>
               <w:top w:type="dxa" w:w="60"/>
               <w:left w:type="dxa" w:w="90"/>
@@ -1358,7 +1358,7 @@
                 <w:sz w:val="18"/>
                 <w:szCs w:val="18"/>
               </w:rPr>
-              <w:t xml:space="preserve">-11.01</w:t>
+              <w:t xml:space="preserve">+5.52</w:t>
             </w:r>
           </w:p>
         </w:tc>
@@ -1390,7 +1390,7 @@
                 <w:sz w:val="18"/>
                 <w:szCs w:val="18"/>
               </w:rPr>
-              <w:t xml:space="preserve">1.45</w:t>
+              <w:t xml:space="preserve">3.86</w:t>
             </w:r>
           </w:p>
         </w:tc>
@@ -1422,7 +1422,7 @@
                 <w:sz w:val="18"/>
                 <w:szCs w:val="18"/>
               </w:rPr>
-              <w:t xml:space="preserve">0.75</w:t>
+              <w:t xml:space="preserve">1.69</w:t>
             </w:r>
           </w:p>
         </w:tc>
@@ -1490,7 +1490,7 @@
                 <w:sz w:val="18"/>
                 <w:szCs w:val="18"/>
               </w:rPr>
-              <w:t xml:space="preserve">12.30</w:t>
+              <w:t xml:space="preserve">3.68</w:t>
             </w:r>
           </w:p>
         </w:tc>
@@ -1503,7 +1503,7 @@
               <w:bottom w:val="single" w:color="BBBBBB" w:sz="1"/>
               <w:right w:val="single" w:color="BBBBBB" w:sz="1"/>
             </w:tcBorders>
-            <w:shd w:fill="F8D7DA" w:val="clear"/>
+            <w:shd w:fill="DDEBD8" w:val="clear"/>
             <w:tcMar>
               <w:top w:type="dxa" w:w="60"/>
               <w:left w:type="dxa" w:w="90"/>
@@ -1523,7 +1523,7 @@
                 <w:sz w:val="18"/>
                 <w:szCs w:val="18"/>
               </w:rPr>
-              <w:t xml:space="preserve">-0.93</w:t>
+              <w:t xml:space="preserve">+2.39</w:t>
             </w:r>
           </w:p>
         </w:tc>
@@ -1556,7 +1556,7 @@
                 <w:sz w:val="18"/>
                 <w:szCs w:val="18"/>
               </w:rPr>
-              <w:t xml:space="preserve">11.95</w:t>
+              <w:t xml:space="preserve">3.70</w:t>
             </w:r>
           </w:p>
         </w:tc>
@@ -1589,7 +1589,7 @@
                 <w:sz w:val="18"/>
                 <w:szCs w:val="18"/>
               </w:rPr>
-              <w:t xml:space="preserve">4.74</w:t>
+              <w:t xml:space="preserve">2.00</w:t>
             </w:r>
           </w:p>
         </w:tc>
@@ -1655,7 +1655,7 @@
                 <w:sz w:val="18"/>
                 <w:szCs w:val="18"/>
               </w:rPr>
-              <w:t xml:space="preserve">14.84</w:t>
+              <w:t xml:space="preserve">7.06</w:t>
             </w:r>
           </w:p>
         </w:tc>
@@ -1688,7 +1688,7 @@
                 <w:sz w:val="18"/>
                 <w:szCs w:val="18"/>
               </w:rPr>
-              <w:t xml:space="preserve">+1.62</w:t>
+              <w:t xml:space="preserve">+5.77</w:t>
             </w:r>
           </w:p>
         </w:tc>
@@ -1720,7 +1720,7 @@
                 <w:sz w:val="18"/>
                 <w:szCs w:val="18"/>
               </w:rPr>
-              <w:t xml:space="preserve">12.73</w:t>
+              <w:t xml:space="preserve">3.94</w:t>
             </w:r>
           </w:p>
         </w:tc>
@@ -1752,7 +1752,7 @@
                 <w:sz w:val="18"/>
                 <w:szCs w:val="18"/>
               </w:rPr>
-              <w:t xml:space="preserve">5.11</w:t>
+              <w:t xml:space="preserve">1.72</w:t>
             </w:r>
           </w:p>
         </w:tc>
@@ -1820,7 +1820,7 @@
                 <w:sz w:val="18"/>
                 <w:szCs w:val="18"/>
               </w:rPr>
-              <w:t xml:space="preserve">14.81</w:t>
+              <w:t xml:space="preserve">7.07</w:t>
             </w:r>
           </w:p>
         </w:tc>
@@ -1853,7 +1853,7 @@
                 <w:sz w:val="18"/>
                 <w:szCs w:val="18"/>
               </w:rPr>
-              <w:t xml:space="preserve">+1.58</w:t>
+              <w:t xml:space="preserve">+5.78</w:t>
             </w:r>
           </w:p>
         </w:tc>
@@ -1886,7 +1886,7 @@
                 <w:sz w:val="18"/>
                 <w:szCs w:val="18"/>
               </w:rPr>
-              <w:t xml:space="preserve">11.40</w:t>
+              <w:t xml:space="preserve">0.93</w:t>
             </w:r>
           </w:p>
         </w:tc>
@@ -1919,7 +1919,7 @@
                 <w:sz w:val="18"/>
                 <w:szCs w:val="18"/>
               </w:rPr>
-              <w:t xml:space="preserve">4.41</w:t>
+              <w:t xml:space="preserve">0.38</w:t>
             </w:r>
           </w:p>
         </w:tc>
@@ -1985,7 +1985,7 @@
                 <w:sz w:val="18"/>
                 <w:szCs w:val="18"/>
               </w:rPr>
-              <w:t xml:space="preserve">20.73</w:t>
+              <w:t xml:space="preserve">6.31</w:t>
             </w:r>
           </w:p>
         </w:tc>
@@ -2017,7 +2017,7 @@
                 <w:sz w:val="18"/>
                 <w:szCs w:val="18"/>
               </w:rPr>
-              <w:t xml:space="preserve">+7.51</w:t>
+              <w:t xml:space="preserve">+5.02</w:t>
             </w:r>
           </w:p>
         </w:tc>
@@ -2049,7 +2049,7 @@
                 <w:sz w:val="18"/>
                 <w:szCs w:val="18"/>
               </w:rPr>
-              <w:t xml:space="preserve">92.16</w:t>
+              <w:t xml:space="preserve">31.40</w:t>
             </w:r>
           </w:p>
         </w:tc>
@@ -2081,7 +2081,7 @@
                 <w:sz w:val="18"/>
                 <w:szCs w:val="18"/>
               </w:rPr>
-              <w:t xml:space="preserve">37.23</w:t>
+              <w:t xml:space="preserve">12.72</w:t>
             </w:r>
           </w:p>
         </w:tc>
@@ -2099,7 +2099,7 @@
         <w:t xml:space="preserve">Leitura: </w:t>
       </w:r>
       <w:r>
-        <w:t xml:space="preserve">o Híbrido RF e os Candidatos híbridos melhoram o recall sobre o baseline (~+1,6pp em R@200); a GNN fica abaixo. Porém, no topo do ranking (MRR@10/NDCG@10), o próprio Baseline é o melhor entre os modelos realistas — a heurística simples ordena bem as primeiras posições. Testes pareados (Wilcoxon+Bonferroni) confirmam: RF &gt; Baseline em recall é significativo; nenhuma abordagem multimodal supera o RF no topo, na base médica.</w:t>
+        <w:t xml:space="preserve">na base de IA (rede de coautoria esparsa), o Texto e os Candidatos híbridos ganham fortemente do baseline em recall (~+5 a +6pp em R@200) e superam até o oráculo topológico — porque candidatos textuais alcançam coautores fora da vizinhança de 2 saltos, que a topologia (e seu teto) não atinge. O Híbrido RF e a GNN ganham menos (~+2,5pp). No topo do ranking (R@10), porém, RF e GNN ainda lideram entre os realistas — a estrutura ordena melhor as primeiras posições. Contraste importante: na base médica (snowball denso), o quadro se invertia — o RF dominava o geral e o topo. Ou seja, o valor do texto/multimodal cresce com a esparsidade da rede de colaboração.</w:t>
       </w:r>
     </w:p>
     <w:p>
@@ -2107,7 +2107,7 @@
         <w:pStyle w:val="Heading1"/>
       </w:pPr>
       <w:r>
-        <w:t xml:space="preserve">4. Gráficos (base médica)</w:t>
+        <w:t xml:space="preserve">4. Gráficos (base de IA, autores ativos em T0)</w:t>
       </w:r>
     </w:p>
     <w:p>
@@ -2116,7 +2116,7 @@
           <w:b/>
           <w:bCs/>
         </w:rPr>
-        <w:t xml:space="preserve">Métricas × K, regime geral (n=5894; barras = IC95%):</w:t>
+        <w:t xml:space="preserve">Métricas × K, autores ativos em T0 (n=2003; barras = IC95%):</w:t>
       </w:r>
     </w:p>
     <w:p>

</xml_diff>

<commit_message>
Inclui a Fusão (CNN+GNN) na comparação, dashboard, gráficos e relatório
final_comparison.py carrega os embeddings fundidos (fusion-run) e avalia a
Fusão (CNN+GNN) no mesmo protocolo T0-ativos (8 modelos, com IC). Listas de
modelos atualizadas em plot_metrics/build_dashboard/gen_report_docx; comentários
do dashboard reescritos p/ a base IA. Fusão: warm R@200=3,99, cool=3,35 — empata
GNN-rerank/RF, abaixo do texto/híbrido (gargalo 2-hop). Dashboard (8 modelos),
gráficos, TABELA_METRICAS.md e RELATORIO_AVALIACAO.docx regenerados.

Co-Authored-By: Claude Opus 4.8 <noreply@anthropic.com>
</commit_message>
<xml_diff>
--- a/docs/RELATORIO_AVALIACAO.docx
+++ b/docs/RELATORIO_AVALIACAO.docx
@@ -1953,7 +1953,7 @@
                 <w:sz w:val="18"/>
                 <w:szCs w:val="18"/>
               </w:rPr>
-              <w:t xml:space="preserve">Oráculo (teto)</w:t>
+              <w:t xml:space="preserve">Fusão (CNN+GNN)</w:t>
             </w:r>
           </w:p>
         </w:tc>
@@ -1985,7 +1985,7 @@
                 <w:sz w:val="18"/>
                 <w:szCs w:val="18"/>
               </w:rPr>
-              <w:t xml:space="preserve">6.31</w:t>
+              <w:t xml:space="preserve">3.66</w:t>
             </w:r>
           </w:p>
         </w:tc>
@@ -1998,6 +1998,7 @@
               <w:bottom w:val="single" w:color="BBBBBB" w:sz="1"/>
               <w:right w:val="single" w:color="BBBBBB" w:sz="1"/>
             </w:tcBorders>
+            <w:shd w:fill="DDEBD8" w:val="clear"/>
             <w:tcMar>
               <w:top w:type="dxa" w:w="60"/>
               <w:left w:type="dxa" w:w="90"/>
@@ -2017,6 +2018,171 @@
                 <w:sz w:val="18"/>
                 <w:szCs w:val="18"/>
               </w:rPr>
+              <w:t xml:space="preserve">+2.37</w:t>
+            </w:r>
+          </w:p>
+        </w:tc>
+        <w:tc>
+          <w:tcPr>
+            <w:tcW w:type="dxa" w:w="1580"/>
+            <w:tcBorders>
+              <w:top w:val="single" w:color="BBBBBB" w:sz="1"/>
+              <w:left w:val="single" w:color="BBBBBB" w:sz="1"/>
+              <w:bottom w:val="single" w:color="BBBBBB" w:sz="1"/>
+              <w:right w:val="single" w:color="BBBBBB" w:sz="1"/>
+            </w:tcBorders>
+            <w:tcMar>
+              <w:top w:type="dxa" w:w="60"/>
+              <w:left w:type="dxa" w:w="90"/>
+              <w:bottom w:type="dxa" w:w="60"/>
+              <w:right w:type="dxa" w:w="90"/>
+            </w:tcMar>
+            <w:vAlign w:val="center"/>
+          </w:tcPr>
+          <w:p>
+            <w:pPr>
+              <w:jc w:val="right"/>
+            </w:pPr>
+            <w:r>
+              <w:rPr>
+                <w:b w:val="false"/>
+                <w:bCs w:val="false"/>
+                <w:sz w:val="18"/>
+                <w:szCs w:val="18"/>
+              </w:rPr>
+              <w:t xml:space="preserve">3.54</w:t>
+            </w:r>
+          </w:p>
+        </w:tc>
+        <w:tc>
+          <w:tcPr>
+            <w:tcW w:type="dxa" w:w="1580"/>
+            <w:tcBorders>
+              <w:top w:val="single" w:color="BBBBBB" w:sz="1"/>
+              <w:left w:val="single" w:color="BBBBBB" w:sz="1"/>
+              <w:bottom w:val="single" w:color="BBBBBB" w:sz="1"/>
+              <w:right w:val="single" w:color="BBBBBB" w:sz="1"/>
+            </w:tcBorders>
+            <w:tcMar>
+              <w:top w:type="dxa" w:w="60"/>
+              <w:left w:type="dxa" w:w="90"/>
+              <w:bottom w:type="dxa" w:w="60"/>
+              <w:right w:type="dxa" w:w="90"/>
+            </w:tcMar>
+            <w:vAlign w:val="center"/>
+          </w:tcPr>
+          <w:p>
+            <w:pPr>
+              <w:jc w:val="right"/>
+            </w:pPr>
+            <w:r>
+              <w:rPr>
+                <w:b w:val="false"/>
+                <w:bCs w:val="false"/>
+                <w:sz w:val="18"/>
+                <w:szCs w:val="18"/>
+              </w:rPr>
+              <w:t xml:space="preserve">1.87</w:t>
+            </w:r>
+          </w:p>
+        </w:tc>
+      </w:tr>
+      <w:tr>
+        <w:tc>
+          <w:tcPr>
+            <w:tcW w:type="dxa" w:w="3200"/>
+            <w:tcBorders>
+              <w:top w:val="single" w:color="BBBBBB" w:sz="1"/>
+              <w:left w:val="single" w:color="BBBBBB" w:sz="1"/>
+              <w:bottom w:val="single" w:color="BBBBBB" w:sz="1"/>
+              <w:right w:val="single" w:color="BBBBBB" w:sz="1"/>
+            </w:tcBorders>
+            <w:shd w:fill="EEF3F8" w:val="clear"/>
+            <w:tcMar>
+              <w:top w:type="dxa" w:w="60"/>
+              <w:left w:type="dxa" w:w="90"/>
+              <w:bottom w:type="dxa" w:w="60"/>
+              <w:right w:type="dxa" w:w="90"/>
+            </w:tcMar>
+            <w:vAlign w:val="center"/>
+          </w:tcPr>
+          <w:p>
+            <w:pPr>
+              <w:jc w:val="left"/>
+            </w:pPr>
+            <w:r>
+              <w:rPr>
+                <w:b w:val="false"/>
+                <w:bCs w:val="false"/>
+                <w:sz w:val="18"/>
+                <w:szCs w:val="18"/>
+              </w:rPr>
+              <w:t xml:space="preserve">Oráculo (teto)</w:t>
+            </w:r>
+          </w:p>
+        </w:tc>
+        <w:tc>
+          <w:tcPr>
+            <w:tcW w:type="dxa" w:w="1500"/>
+            <w:tcBorders>
+              <w:top w:val="single" w:color="BBBBBB" w:sz="1"/>
+              <w:left w:val="single" w:color="BBBBBB" w:sz="1"/>
+              <w:bottom w:val="single" w:color="BBBBBB" w:sz="1"/>
+              <w:right w:val="single" w:color="BBBBBB" w:sz="1"/>
+            </w:tcBorders>
+            <w:shd w:fill="EEF3F8" w:val="clear"/>
+            <w:tcMar>
+              <w:top w:type="dxa" w:w="60"/>
+              <w:left w:type="dxa" w:w="90"/>
+              <w:bottom w:type="dxa" w:w="60"/>
+              <w:right w:type="dxa" w:w="90"/>
+            </w:tcMar>
+            <w:vAlign w:val="center"/>
+          </w:tcPr>
+          <w:p>
+            <w:pPr>
+              <w:jc w:val="right"/>
+            </w:pPr>
+            <w:r>
+              <w:rPr>
+                <w:b w:val="false"/>
+                <w:bCs w:val="false"/>
+                <w:sz w:val="18"/>
+                <w:szCs w:val="18"/>
+              </w:rPr>
+              <w:t xml:space="preserve">6.31</w:t>
+            </w:r>
+          </w:p>
+        </w:tc>
+        <w:tc>
+          <w:tcPr>
+            <w:tcW w:type="dxa" w:w="1500"/>
+            <w:tcBorders>
+              <w:top w:val="single" w:color="BBBBBB" w:sz="1"/>
+              <w:left w:val="single" w:color="BBBBBB" w:sz="1"/>
+              <w:bottom w:val="single" w:color="BBBBBB" w:sz="1"/>
+              <w:right w:val="single" w:color="BBBBBB" w:sz="1"/>
+            </w:tcBorders>
+            <w:shd w:fill="EEF3F8" w:val="clear"/>
+            <w:tcMar>
+              <w:top w:type="dxa" w:w="60"/>
+              <w:left w:type="dxa" w:w="90"/>
+              <w:bottom w:type="dxa" w:w="60"/>
+              <w:right w:type="dxa" w:w="90"/>
+            </w:tcMar>
+            <w:vAlign w:val="center"/>
+          </w:tcPr>
+          <w:p>
+            <w:pPr>
+              <w:jc w:val="right"/>
+            </w:pPr>
+            <w:r>
+              <w:rPr>
+                <w:b/>
+                <w:bCs/>
+                <w:sz w:val="18"/>
+                <w:szCs w:val="18"/>
+              </w:rPr>
               <w:t xml:space="preserve">+5.02</w:t>
             </w:r>
           </w:p>
@@ -2030,6 +2196,7 @@
               <w:bottom w:val="single" w:color="BBBBBB" w:sz="1"/>
               <w:right w:val="single" w:color="BBBBBB" w:sz="1"/>
             </w:tcBorders>
+            <w:shd w:fill="EEF3F8" w:val="clear"/>
             <w:tcMar>
               <w:top w:type="dxa" w:w="60"/>
               <w:left w:type="dxa" w:w="90"/>
@@ -2062,6 +2229,7 @@
               <w:bottom w:val="single" w:color="BBBBBB" w:sz="1"/>
               <w:right w:val="single" w:color="BBBBBB" w:sz="1"/>
             </w:tcBorders>
+            <w:shd w:fill="EEF3F8" w:val="clear"/>
             <w:tcMar>
               <w:top w:type="dxa" w:w="60"/>
               <w:left w:type="dxa" w:w="90"/>

</xml_diff>

<commit_message>
Relatório científico (storytelling): diagramas, exemplo, validação da tese
gen_report_docx.js reescrito como documento científico de 12 seções: resumo,
hipóteses (central vs refinada), fluxo metodológico (diagrama), construção passo
a passo a partir do baseline (motivação→método→resultado), comparação com baseline,
insight do espaço de candidatos (diagrama + exemplo Ajzen→Fishbein), cold-start,
experimentos (3-hop, ablação KG), validação da tese (veredito por hipótese),
discussão (lacunas/dados semânticos/combinações) e caminhos futuros.
make_diagrams.py (fluxo + espaço de candidatos); pick_example.py (exemplo real).

Co-Authored-By: Claude Opus 4.8 <noreply@anthropic.com>
</commit_message>
<xml_diff>
--- a/docs/RELATORIO_AVALIACAO.docx
+++ b/docs/RELATORIO_AVALIACAO.docx
@@ -49,10 +49,10 @@
       <w:r>
         <w:rPr>
           <w:color w:val="333333"/>
-          <w:sz w:val="23"/>
-          <w:szCs w:val="23"/>
+          <w:sz w:val="22"/>
+          <w:szCs w:val="22"/>
         </w:rPr>
-        <w:t xml:space="preserve">Relatório de Avaliação — Desenvolvimento, Avanços e Comparação</w:t>
+        <w:t xml:space="preserve">Relatório Científico — Construção, Resultados e Validação da Tese</w:t>
       </w:r>
     </w:p>
     <w:p>
@@ -426,7 +426,7 @@
                 <w:sz w:val="18"/>
                 <w:szCs w:val="18"/>
               </w:rPr>
-              <w:t xml:space="preserve">Médica (snowball, 19.120 autores) e IA temática (45.732 autores)</w:t>
+              <w:t xml:space="preserve">Médica (snowball, densa) e IA temática (45.732 autores, esparsa)</w:t>
             </w:r>
           </w:p>
         </w:tc>
@@ -492,7 +492,7 @@
                 <w:sz w:val="18"/>
                 <w:szCs w:val="18"/>
               </w:rPr>
-              <w:t xml:space="preserve">Split temporal T0→T1; IC95% bootstrap; Wilcoxon+Bonferroni; PYTHONHASHSEED=0</w:t>
+              <w:t xml:space="preserve">Predição de links T0→T1; IC95% bootstrap; Wilcoxon+Bonferroni; PYTHONHASHSEED=0</w:t>
             </w:r>
           </w:p>
         </w:tc>
@@ -544,12 +544,12 @@
         <w:pStyle w:val="Heading1"/>
       </w:pPr>
       <w:r>
-        <w:t xml:space="preserve">1. Objetivo</w:t>
-      </w:r>
-    </w:p>
-    <w:p>
-      <w:r>
-        <w:t xml:space="preserve">Desenvolver e avaliar um sistema híbrido de recomendação de coautores que combina representações textuais (CNN/SciBERT) e estruturais (GNN heterogênea) sobre um Grafo de Conhecimento do OpenAlex, tratando a recomendação como predição de links futuros (T0→T1). Este relatório descreve, passo a passo, o que foi feito, os avanços encontrados e a comparação com o modelo de referência (baseline).</w:t>
+        <w:t xml:space="preserve">1. Resumo executivo</w:t>
+      </w:r>
+    </w:p>
+    <w:p>
+      <w:r>
+        <w:t xml:space="preserve">Investigamos a recomendação de coautores como predição de links futuros, comparando, sob um protocolo único, abordagens estruturais (topologia, Random Forest, GNN heterogênea) e textuais (SciBERT/CNN), além de sua fusão e do enriquecimento por IA Generativa. Principal achado: o gargalo não é a representação, e sim a GERAÇÃO DE CANDIDATOS — a topologia alcança apenas ~5% dos coautores futuros (mesmo a 3 saltos), enquanto o sinal textual recupera colaborações fora da estrutura. Em redes esparsas (domínio de IA) e, sobretudo, no cold-start, o texto é decisivo — onde a topologia é nula, é a única fonte de sinal. A hipótese da tese confirma-se numa forma refinada (ver Seção 9).</w:t>
       </w:r>
     </w:p>
     <w:p>
@@ -557,12 +557,124 @@
         <w:pStyle w:val="Heading1"/>
       </w:pPr>
       <w:r>
-        <w:t xml:space="preserve">2. Passo a passo do desenvolvimento</w:t>
-      </w:r>
-    </w:p>
-    <w:p>
-      <w:r>
-        <w:t xml:space="preserve">Cada etapa foi construída de forma incremental, testada e avaliada sob o mesmo protocolo. Resumo do que foi feito e o achado de cada etapa:</w:t>
+        <w:t xml:space="preserve">2. Problema e hipóteses</w:t>
+      </w:r>
+    </w:p>
+    <w:p>
+      <w:r>
+        <w:t xml:space="preserve">Problema: dado um autor-alvo e seu histórico até um instante T0, recomendar potenciais novos coautores, validando contra colaborações reais observadas no período seguinte T1.</w:t>
+      </w:r>
+    </w:p>
+    <w:p>
+      <w:r>
+        <w:rPr>
+          <w:b/>
+          <w:bCs/>
+        </w:rPr>
+        <w:t xml:space="preserve">Hipótese central (qualificação): </w:t>
+      </w:r>
+      <w:r>
+        <w:t xml:space="preserve">a combinação de representações textuais (CNN) e estruturais (GNN) supera cada uma isolada.</w:t>
+      </w:r>
+    </w:p>
+    <w:p>
+      <w:r>
+        <w:rPr>
+          <w:b/>
+          <w:bCs/>
+        </w:rPr>
+        <w:t xml:space="preserve">Hipótese refinada (este trabalho): </w:t>
+      </w:r>
+      <w:r>
+        <w:t xml:space="preserve">o valor do sinal textual está em ampliar o espaço de candidatos para além da vizinhança topológica — sendo decisivo quando a rede é esparsa ou o autor não tem histórico (cold-start), e complementar (não dominante no topo) quando há estrutura rica.</w:t>
+      </w:r>
+    </w:p>
+    <w:p>
+      <w:pPr>
+        <w:pStyle w:val="Heading1"/>
+      </w:pPr>
+      <w:r>
+        <w:t xml:space="preserve">3. Arquitetura e fluxo metodológico</w:t>
+      </w:r>
+    </w:p>
+    <w:p>
+      <w:r>
+        <w:t xml:space="preserve">O sistema organiza-se em coleta/preparação, construção do Grafo de Conhecimento heterogêneo, duas vertentes de modelagem (estrutural e textual), geração de candidatos e avaliação temporal estratificada por regime de conectividade (warm/cool/cold).</w:t>
+      </w:r>
+    </w:p>
+    <w:p>
+      <w:pPr>
+        <w:spacing w:before="80"/>
+        <w:jc w:val="center"/>
+      </w:pPr>
+      <w:r>
+        <w:drawing>
+          <wp:inline distT="0" distB="0" distL="0" distR="0">
+            <wp:extent cx="5905500" cy="3333750"/>
+            <wp:effectExtent t="0" r="0" b="0" l="0"/>
+            <wp:docPr id="1" name="diagrama_fluxo.png" descr="diagrama_fluxo.png" title="diagrama_fluxo.png"/>
+            <wp:cNvGraphicFramePr>
+              <a:graphicFrameLocks xmlns:a="http://schemas.openxmlformats.org/drawingml/2006/main" noChangeAspect="1"/>
+            </wp:cNvGraphicFramePr>
+            <a:graphic xmlns:a="http://schemas.openxmlformats.org/drawingml/2006/main">
+              <a:graphicData uri="http://schemas.openxmlformats.org/drawingml/2006/picture">
+                <pic:pic xmlns:pic="http://schemas.openxmlformats.org/drawingml/2006/picture">
+                  <pic:nvPicPr>
+                    <pic:cNvPr id="0" name="" descr=""/>
+                    <pic:cNvPicPr>
+                      <a:picLocks noChangeAspect="1" noChangeArrowheads="1"/>
+                    </pic:cNvPicPr>
+                  </pic:nvPicPr>
+                  <pic:blipFill>
+                    <a:blip r:embed="rId8" cstate="none"/>
+                    <a:srcRect/>
+                    <a:stretch>
+                      <a:fillRect/>
+                    </a:stretch>
+                  </pic:blipFill>
+                  <pic:spPr bwMode="auto">
+                    <a:xfrm>
+                      <a:off x="0" y="0"/>
+                      <a:ext cx="5905500" cy="3333750"/>
+                    </a:xfrm>
+                    <a:prstGeom prst="rect">
+                      <a:avLst/>
+                    </a:prstGeom>
+                  </pic:spPr>
+                </pic:pic>
+              </a:graphicData>
+            </a:graphic>
+          </wp:inline>
+        </w:drawing>
+      </w:r>
+    </w:p>
+    <w:p>
+      <w:pPr>
+        <w:spacing w:after="120"/>
+        <w:jc w:val="center"/>
+      </w:pPr>
+      <w:r>
+        <w:rPr>
+          <w:i/>
+          <w:iCs/>
+          <w:color w:val="666666"/>
+          <w:sz w:val="16"/>
+          <w:szCs w:val="16"/>
+        </w:rPr>
+        <w:t xml:space="preserve">Figura 1 — Fluxo metodológico. O gargalo está na geração de candidatos.</w:t>
+      </w:r>
+    </w:p>
+    <w:p>
+      <w:pPr>
+        <w:pStyle w:val="Heading1"/>
+      </w:pPr>
+      <w:r>
+        <w:t xml:space="preserve">4. Construção passo a passo (a partir do baseline)</w:t>
+      </w:r>
+    </w:p>
+    <w:p>
+      <w:r>
+        <w:t xml:space="preserve">Cada etapa segue o ciclo científico motivação → método → resultado → conclusão. O baseline de referência é o Common Neighbors (heurística de vizinhança de 2 saltos).</w:t>
       </w:r>
     </w:p>
     <w:p>
@@ -578,10 +690,10 @@
           <w:b/>
           <w:bCs/>
         </w:rPr>
-        <w:t xml:space="preserve">Coleta e preparação (OpenAlex): </w:t>
-      </w:r>
-      <w:r>
-        <w:t xml:space="preserve">pipeline de coleta (snowball e temática), limpeza (inglês, ano≥2004, deduplicação) e gate de qualidade. Resultado: bases reprodutíveis e versionadas.</w:t>
+        <w:t xml:space="preserve">Baseline (Common Neighbors). </w:t>
+      </w:r>
+      <w:r>
+        <w:t xml:space="preserve">Método: candidatos de 2 saltos ranqueados por nº de vizinhos em comum. Resultado: referência consistente, forte no topo do ranking. Conclusão: ponto de partida; limitado pela topologia.</w:t>
       </w:r>
     </w:p>
     <w:p>
@@ -597,10 +709,10 @@
           <w:b/>
           <w:bCs/>
         </w:rPr>
-        <w:t xml:space="preserve">Grafo de Conhecimento heterogêneo: </w:t>
-      </w:r>
-      <w:r>
-        <w:t xml:space="preserve">5 entidades (autor, artigo, instituição, venue, conceito) e 6 relações; teto anti-consórcio de 50 coautores/artigo. Resultado: KG materializado em PyTorch Geometric.</w:t>
+        <w:t xml:space="preserve">Random Forest (reranking supervisionado). </w:t>
+      </w:r>
+      <w:r>
+        <w:t xml:space="preserve">Método: RF sobre features topológicas (CN, Jaccard, Adamic-Adar) nos candidatos de 2 saltos. Resultado: ganho significativo de recall sobre o baseline. Conclusão: combinar sinais topológicos ajuda — mas continua preso ao 2-hop.</w:t>
       </w:r>
     </w:p>
     <w:p>
@@ -616,10 +728,10 @@
           <w:b/>
           <w:bCs/>
         </w:rPr>
-        <w:t xml:space="preserve">Baselines de referência: </w:t>
-      </w:r>
-      <w:r>
-        <w:t xml:space="preserve">Common Neighbors (baseline), oráculo topológico (teto) e Random Forest sobre features topológicas. Achado: o RF melhora o recall sobre o baseline.</w:t>
+        <w:t xml:space="preserve">Módulo textual (SciBERT/CNN). </w:t>
+      </w:r>
+      <w:r>
+        <w:t xml:space="preserve">Método: embeddings de título+abstract; similaridade entre autores. Resultado: fraco no geral, mas forte em baixa conectividade. Conclusão: o conteúdo carrega sinal que a estrutura não tem.</w:t>
       </w:r>
     </w:p>
     <w:p>
@@ -635,10 +747,10 @@
           <w:b/>
           <w:bCs/>
         </w:rPr>
-        <w:t xml:space="preserve">Módulo textual (CNN/BERT): </w:t>
-      </w:r>
-      <w:r>
-        <w:t xml:space="preserve">comparação de encoders (TF-IDF, BERT, SciBERT, SPECTER). Achado: SciBERT≈SPECTER &gt; BERT &gt; TF-IDF; texto forte na baixa conectividade.</w:t>
+        <w:t xml:space="preserve">GNN heterogênea. </w:t>
+      </w:r>
+      <w:r>
+        <w:t xml:space="preserve">Método: reranker 2-hop com agregação sobre o KG. Resultado: empata o RF. Conclusão: a representação profunda não supera o RF sob o mesmo espaço de candidatos.</w:t>
       </w:r>
     </w:p>
     <w:p>
@@ -654,10 +766,10 @@
           <w:b/>
           <w:bCs/>
         </w:rPr>
-        <w:t xml:space="preserve">GNN heterogênea: </w:t>
-      </w:r>
-      <w:r>
-        <w:t xml:space="preserve">reranker sobre candidatos de 2 saltos com features textuais nos nós. Achado: competitiva, mas não supera o RF; ranqueador da GNN é fraco.</w:t>
+        <w:t xml:space="preserve">Fusão end-to-end (CNN+GNN). </w:t>
+      </w:r>
+      <w:r>
+        <w:t xml:space="preserve">Método: z_texto ⊕ z_grafo → camada densa. Resultado: empata a GNN. Conclusão: fundir representações não basta.</w:t>
       </w:r>
     </w:p>
     <w:p>
@@ -673,10 +785,10 @@
           <w:b/>
           <w:bCs/>
         </w:rPr>
-        <w:t xml:space="preserve">Fusão end-to-end CNN+GNN (Eq. 10): </w:t>
-      </w:r>
-      <w:r>
-        <w:t xml:space="preserve">treino conjunto. Achado: empatou com a GNN; fundir representações não bastou.</w:t>
+        <w:t xml:space="preserve">Enriquecimento por IA Generativa. </w:t>
+      </w:r>
+      <w:r>
+        <w:t xml:space="preserve">Método: atributos de alto nível (estilo, contribuição) extraídos por LLM (OpenAI e Claude) como nós do KG. Resultado: neutro/negativo. Conclusão: categorias ruidosas não agregam.</w:t>
       </w:r>
     </w:p>
     <w:p>
@@ -692,48 +804,10 @@
           <w:b/>
           <w:bCs/>
         </w:rPr>
-        <w:t xml:space="preserve">Enriquecimento GenAI (OpenAI + Claude): </w:t>
-      </w:r>
-      <w:r>
-        <w:t xml:space="preserve">extração de atributos de alto nível dos abstracts (estilo, tipo de contribuição) como nós do KG. Achado: neutro/negativo — categorias ruidosas e de baixa variância.</w:t>
-      </w:r>
-    </w:p>
-    <w:p>
-      <w:pPr>
-        <w:pStyle w:val="ListParagraph"/>
-        <w:numPr>
-          <w:ilvl w:val="0"/>
-          <w:numId w:val="2"/>
-        </w:numPr>
-      </w:pPr>
-      <w:r>
-        <w:rPr>
-          <w:b/>
-          <w:bCs/>
-        </w:rPr>
-        <w:t xml:space="preserve">Candidatos híbridos (estrutura ∪ texto): </w:t>
-      </w:r>
-      <w:r>
-        <w:t xml:space="preserve">ampliar o pool com vizinhos textuais. Achado: empata o RF no geral e o supera em cobertura; o gargalo era a geração de candidatos, não a representação.</w:t>
-      </w:r>
-    </w:p>
-    <w:p>
-      <w:pPr>
-        <w:pStyle w:val="ListParagraph"/>
-        <w:numPr>
-          <w:ilvl w:val="0"/>
-          <w:numId w:val="2"/>
-        </w:numPr>
-      </w:pPr>
-      <w:r>
-        <w:rPr>
-          <w:b/>
-          <w:bCs/>
-        </w:rPr>
-        <w:t xml:space="preserve">Base de IA temática + cold-start: </w:t>
-      </w:r>
-      <w:r>
-        <w:t xml:space="preserve">coleta focada em IA (45.732 autores) que populou os regimes cool/cold. Achado central: ver Seção 5.</w:t>
+        <w:t xml:space="preserve">Candidatos híbridos (estrutura ∪ texto). </w:t>
+      </w:r>
+      <w:r>
+        <w:t xml:space="preserve">Método: ampliar o pool com vizinhos textuais. Resultado: empata/supera o RF em cobertura; o ganho vem do alcance. Conclusão: o gargalo era a geração de candidatos.</w:t>
       </w:r>
     </w:p>
     <w:p>
@@ -741,19 +815,19 @@
         <w:pStyle w:val="Heading1"/>
       </w:pPr>
       <w:r>
-        <w:t xml:space="preserve">3. Comparação com o baseline (base de IA, autores ativos em T0)</w:t>
-      </w:r>
-    </w:p>
-    <w:p>
-      <w:r>
-        <w:t xml:space="preserve">Δ vs Baseline = ganho/perda em Recall@200 sobre o Common Neighbors, na base de IA. </w:t>
+        <w:t xml:space="preserve">5. Comparação com o baseline</w:t>
+      </w:r>
+    </w:p>
+    <w:p>
+      <w:r>
+        <w:t xml:space="preserve">Δ vs Baseline = ganho em Recall@200 sobre o Common Neighbors (base de IA, autores ativos em T0). </w:t>
       </w:r>
       <w:r>
         <w:rPr>
           <w:i/>
           <w:iCs/>
         </w:rPr>
-        <w:t xml:space="preserve">Verde = ganho; vermelho = perda. Oráculo é o teto topológico (não é modelo operacional).</w:t>
+        <w:t xml:space="preserve">Verde = ganho; vermelho = perda. Oráculo = teto topológico.</w:t>
       </w:r>
     </w:p>
     <w:tbl>
@@ -2257,38 +2331,7 @@
     </w:tbl>
     <w:p>
       <w:pPr>
-        <w:spacing w:before="120"/>
-      </w:pPr>
-      <w:r>
-        <w:rPr>
-          <w:b/>
-          <w:bCs/>
-        </w:rPr>
-        <w:t xml:space="preserve">Leitura: </w:t>
-      </w:r>
-      <w:r>
-        <w:t xml:space="preserve">na base de IA (rede de coautoria esparsa), o Texto e os Candidatos híbridos ganham fortemente do baseline em recall (~+5 a +6pp em R@200) e superam até o oráculo topológico — porque candidatos textuais alcançam coautores fora da vizinhança de 2 saltos, que a topologia (e seu teto) não atinge. O Híbrido RF e a GNN ganham menos (~+2,5pp). No topo do ranking (R@10), porém, RF e GNN ainda lideram entre os realistas — a estrutura ordena melhor as primeiras posições. Contraste importante: na base médica (snowball denso), o quadro se invertia — o RF dominava o geral e o topo. Ou seja, o valor do texto/multimodal cresce com a esparsidade da rede de colaboração.</w:t>
-      </w:r>
-    </w:p>
-    <w:p>
-      <w:pPr>
-        <w:pStyle w:val="Heading1"/>
-      </w:pPr>
-      <w:r>
-        <w:t xml:space="preserve">4. Gráficos (base de IA, autores ativos em T0)</w:t>
-      </w:r>
-    </w:p>
-    <w:p>
-      <w:r>
-        <w:rPr>
-          <w:b/>
-          <w:bCs/>
-        </w:rPr>
-        <w:t xml:space="preserve">Métricas × K, autores ativos em T0 (n=2003; barras = IC95%):</w:t>
-      </w:r>
-    </w:p>
-    <w:p>
-      <w:pPr>
+        <w:spacing w:before="80"/>
         <w:jc w:val="center"/>
       </w:pPr>
       <w:r>
@@ -2297,596 +2340,6 @@
             <wp:extent cx="5715000" cy="3209925"/>
             <wp:effectExtent t="0" r="0" b="0" l="0"/>
             <wp:docPr id="1" name="metricas_overall.png" descr="metricas_overall.png" title="metricas_overall.png"/>
-            <wp:cNvGraphicFramePr>
-              <a:graphicFrameLocks xmlns:a="http://schemas.openxmlformats.org/drawingml/2006/main" noChangeAspect="1"/>
-            </wp:cNvGraphicFramePr>
-            <a:graphic xmlns:a="http://schemas.openxmlformats.org/drawingml/2006/main">
-              <a:graphicData uri="http://schemas.openxmlformats.org/drawingml/2006/picture">
-                <pic:pic xmlns:pic="http://schemas.openxmlformats.org/drawingml/2006/picture">
-                  <pic:nvPicPr>
-                    <pic:cNvPr id="0" name="" descr=""/>
-                    <pic:cNvPicPr>
-                      <a:picLocks noChangeAspect="1" noChangeArrowheads="1"/>
-                    </pic:cNvPicPr>
-                  </pic:nvPicPr>
-                  <pic:blipFill>
-                    <a:blip r:embed="rId8" cstate="none"/>
-                    <a:srcRect/>
-                    <a:stretch>
-                      <a:fillRect/>
-                    </a:stretch>
-                  </pic:blipFill>
-                  <pic:spPr bwMode="auto">
-                    <a:xfrm>
-                      <a:off x="0" y="0"/>
-                      <a:ext cx="5715000" cy="3209925"/>
-                    </a:xfrm>
-                    <a:prstGeom prst="rect">
-                      <a:avLst/>
-                    </a:prstGeom>
-                  </pic:spPr>
-                </pic:pic>
-              </a:graphicData>
-            </a:graphic>
-          </wp:inline>
-        </w:drawing>
-      </w:r>
-    </w:p>
-    <w:p>
-      <w:pPr>
-        <w:pStyle w:val="Heading1"/>
-      </w:pPr>
-      <w:r>
-        <w:t xml:space="preserve">5. Avanço principal: cold-start na base de IA</w:t>
-      </w:r>
-    </w:p>
-    <w:p>
-      <w:r>
-        <w:t xml:space="preserve">Na base médica (snowball denso), os regimes de baixa conectividade eram pequenos demais (cool n=78, cold n=3) para conclusões. Coletamos uma base temática de IA e correlatas (45.732 autores), que por ser menos densa populou esses regimes: cool n=783, cold n=53. Com poder estatístico real, o avanço fica claro:</w:t>
-      </w:r>
-    </w:p>
-    <w:tbl>
-      <w:tblPr>
-        <w:tblW w:type="dxa" w:w="9360"/>
-        <w:tblBorders>
-          <w:top w:val="single" w:color="auto" w:sz="4"/>
-          <w:left w:val="single" w:color="auto" w:sz="4"/>
-          <w:bottom w:val="single" w:color="auto" w:sz="4"/>
-          <w:right w:val="single" w:color="auto" w:sz="4"/>
-          <w:insideH w:val="single" w:color="auto" w:sz="4"/>
-          <w:insideV w:val="single" w:color="auto" w:sz="4"/>
-        </w:tblBorders>
-      </w:tblPr>
-      <w:tblGrid>
-        <w:gridCol w:w="4000"/>
-        <w:gridCol w:w="2680"/>
-        <w:gridCol w:w="2680"/>
-      </w:tblGrid>
-      <w:tr>
-        <w:trPr>
-          <w:tblHeader/>
-        </w:trPr>
-        <w:tc>
-          <w:tcPr>
-            <w:tcW w:type="dxa" w:w="4000"/>
-            <w:tcBorders>
-              <w:top w:val="single" w:color="BBBBBB" w:sz="1"/>
-              <w:left w:val="single" w:color="BBBBBB" w:sz="1"/>
-              <w:bottom w:val="single" w:color="BBBBBB" w:sz="1"/>
-              <w:right w:val="single" w:color="BBBBBB" w:sz="1"/>
-            </w:tcBorders>
-            <w:shd w:fill="1F4E79" w:val="clear"/>
-            <w:tcMar>
-              <w:top w:type="dxa" w:w="60"/>
-              <w:left w:type="dxa" w:w="90"/>
-              <w:bottom w:type="dxa" w:w="60"/>
-              <w:right w:type="dxa" w:w="90"/>
-            </w:tcMar>
-            <w:vAlign w:val="center"/>
-          </w:tcPr>
-          <w:p>
-            <w:r>
-              <w:rPr>
-                <w:b/>
-                <w:bCs/>
-                <w:color w:val="FFFFFF"/>
-                <w:sz w:val="18"/>
-                <w:szCs w:val="18"/>
-              </w:rPr>
-              <w:t xml:space="preserve">Modelo</w:t>
-            </w:r>
-          </w:p>
-        </w:tc>
-        <w:tc>
-          <w:tcPr>
-            <w:tcW w:type="dxa" w:w="2680"/>
-            <w:tcBorders>
-              <w:top w:val="single" w:color="BBBBBB" w:sz="1"/>
-              <w:left w:val="single" w:color="BBBBBB" w:sz="1"/>
-              <w:bottom w:val="single" w:color="BBBBBB" w:sz="1"/>
-              <w:right w:val="single" w:color="BBBBBB" w:sz="1"/>
-            </w:tcBorders>
-            <w:shd w:fill="1F4E79" w:val="clear"/>
-            <w:tcMar>
-              <w:top w:type="dxa" w:w="60"/>
-              <w:left w:type="dxa" w:w="90"/>
-              <w:bottom w:type="dxa" w:w="60"/>
-              <w:right w:type="dxa" w:w="90"/>
-            </w:tcMar>
-            <w:vAlign w:val="center"/>
-          </w:tcPr>
-          <w:p>
-            <w:r>
-              <w:rPr>
-                <w:b/>
-                <w:bCs/>
-                <w:color w:val="FFFFFF"/>
-                <w:sz w:val="18"/>
-                <w:szCs w:val="18"/>
-              </w:rPr>
-              <w:t xml:space="preserve">cool R@200 (n=783)</w:t>
-            </w:r>
-          </w:p>
-        </w:tc>
-        <w:tc>
-          <w:tcPr>
-            <w:tcW w:type="dxa" w:w="2680"/>
-            <w:tcBorders>
-              <w:top w:val="single" w:color="BBBBBB" w:sz="1"/>
-              <w:left w:val="single" w:color="BBBBBB" w:sz="1"/>
-              <w:bottom w:val="single" w:color="BBBBBB" w:sz="1"/>
-              <w:right w:val="single" w:color="BBBBBB" w:sz="1"/>
-            </w:tcBorders>
-            <w:shd w:fill="1F4E79" w:val="clear"/>
-            <w:tcMar>
-              <w:top w:type="dxa" w:w="60"/>
-              <w:left w:type="dxa" w:w="90"/>
-              <w:bottom w:type="dxa" w:w="60"/>
-              <w:right w:type="dxa" w:w="90"/>
-            </w:tcMar>
-            <w:vAlign w:val="center"/>
-          </w:tcPr>
-          <w:p>
-            <w:r>
-              <w:rPr>
-                <w:b/>
-                <w:bCs/>
-                <w:color w:val="FFFFFF"/>
-                <w:sz w:val="18"/>
-                <w:szCs w:val="18"/>
-              </w:rPr>
-              <w:t xml:space="preserve">cold R@200 (n=53)</w:t>
-            </w:r>
-          </w:p>
-        </w:tc>
-      </w:tr>
-      <w:tr>
-        <w:tc>
-          <w:tcPr>
-            <w:tcW w:type="dxa" w:w="4000"/>
-            <w:tcBorders>
-              <w:top w:val="single" w:color="BBBBBB" w:sz="1"/>
-              <w:left w:val="single" w:color="BBBBBB" w:sz="1"/>
-              <w:bottom w:val="single" w:color="BBBBBB" w:sz="1"/>
-              <w:right w:val="single" w:color="BBBBBB" w:sz="1"/>
-            </w:tcBorders>
-            <w:tcMar>
-              <w:top w:type="dxa" w:w="60"/>
-              <w:left w:type="dxa" w:w="90"/>
-              <w:bottom w:type="dxa" w:w="60"/>
-              <w:right w:type="dxa" w:w="90"/>
-            </w:tcMar>
-            <w:vAlign w:val="center"/>
-          </w:tcPr>
-          <w:p>
-            <w:pPr>
-              <w:jc w:val="left"/>
-            </w:pPr>
-            <w:r>
-              <w:rPr>
-                <w:b w:val="false"/>
-                <w:bCs w:val="false"/>
-                <w:sz w:val="18"/>
-                <w:szCs w:val="18"/>
-              </w:rPr>
-              <w:t xml:space="preserve">Baseline (CN)</w:t>
-            </w:r>
-          </w:p>
-        </w:tc>
-        <w:tc>
-          <w:tcPr>
-            <w:tcW w:type="dxa" w:w="2680"/>
-            <w:tcBorders>
-              <w:top w:val="single" w:color="BBBBBB" w:sz="1"/>
-              <w:left w:val="single" w:color="BBBBBB" w:sz="1"/>
-              <w:bottom w:val="single" w:color="BBBBBB" w:sz="1"/>
-              <w:right w:val="single" w:color="BBBBBB" w:sz="1"/>
-            </w:tcBorders>
-            <w:tcMar>
-              <w:top w:type="dxa" w:w="60"/>
-              <w:left w:type="dxa" w:w="90"/>
-              <w:bottom w:type="dxa" w:w="60"/>
-              <w:right w:type="dxa" w:w="90"/>
-            </w:tcMar>
-            <w:vAlign w:val="center"/>
-          </w:tcPr>
-          <w:p>
-            <w:pPr>
-              <w:jc w:val="right"/>
-            </w:pPr>
-            <w:r>
-              <w:rPr>
-                <w:b w:val="false"/>
-                <w:bCs w:val="false"/>
-                <w:sz w:val="18"/>
-                <w:szCs w:val="18"/>
-              </w:rPr>
-              <w:t xml:space="preserve">1.3</w:t>
-            </w:r>
-          </w:p>
-        </w:tc>
-        <w:tc>
-          <w:tcPr>
-            <w:tcW w:type="dxa" w:w="2680"/>
-            <w:tcBorders>
-              <w:top w:val="single" w:color="BBBBBB" w:sz="1"/>
-              <w:left w:val="single" w:color="BBBBBB" w:sz="1"/>
-              <w:bottom w:val="single" w:color="BBBBBB" w:sz="1"/>
-              <w:right w:val="single" w:color="BBBBBB" w:sz="1"/>
-            </w:tcBorders>
-            <w:shd w:fill="F8D7DA" w:val="clear"/>
-            <w:tcMar>
-              <w:top w:type="dxa" w:w="60"/>
-              <w:left w:type="dxa" w:w="90"/>
-              <w:bottom w:type="dxa" w:w="60"/>
-              <w:right w:type="dxa" w:w="90"/>
-            </w:tcMar>
-            <w:vAlign w:val="center"/>
-          </w:tcPr>
-          <w:p>
-            <w:pPr>
-              <w:jc w:val="right"/>
-            </w:pPr>
-            <w:r>
-              <w:rPr>
-                <w:b/>
-                <w:bCs/>
-                <w:sz w:val="18"/>
-                <w:szCs w:val="18"/>
-              </w:rPr>
-              <w:t xml:space="preserve">0.0</w:t>
-            </w:r>
-          </w:p>
-        </w:tc>
-      </w:tr>
-      <w:tr>
-        <w:tc>
-          <w:tcPr>
-            <w:tcW w:type="dxa" w:w="4000"/>
-            <w:tcBorders>
-              <w:top w:val="single" w:color="BBBBBB" w:sz="1"/>
-              <w:left w:val="single" w:color="BBBBBB" w:sz="1"/>
-              <w:bottom w:val="single" w:color="BBBBBB" w:sz="1"/>
-              <w:right w:val="single" w:color="BBBBBB" w:sz="1"/>
-            </w:tcBorders>
-            <w:shd w:fill="EEF3F8" w:val="clear"/>
-            <w:tcMar>
-              <w:top w:type="dxa" w:w="60"/>
-              <w:left w:type="dxa" w:w="90"/>
-              <w:bottom w:type="dxa" w:w="60"/>
-              <w:right w:type="dxa" w:w="90"/>
-            </w:tcMar>
-            <w:vAlign w:val="center"/>
-          </w:tcPr>
-          <w:p>
-            <w:pPr>
-              <w:jc w:val="left"/>
-            </w:pPr>
-            <w:r>
-              <w:rPr>
-                <w:b w:val="false"/>
-                <w:bCs w:val="false"/>
-                <w:sz w:val="18"/>
-                <w:szCs w:val="18"/>
-              </w:rPr>
-              <w:t xml:space="preserve">Híbrido RF</w:t>
-            </w:r>
-          </w:p>
-        </w:tc>
-        <w:tc>
-          <w:tcPr>
-            <w:tcW w:type="dxa" w:w="2680"/>
-            <w:tcBorders>
-              <w:top w:val="single" w:color="BBBBBB" w:sz="1"/>
-              <w:left w:val="single" w:color="BBBBBB" w:sz="1"/>
-              <w:bottom w:val="single" w:color="BBBBBB" w:sz="1"/>
-              <w:right w:val="single" w:color="BBBBBB" w:sz="1"/>
-            </w:tcBorders>
-            <w:shd w:fill="EEF3F8" w:val="clear"/>
-            <w:tcMar>
-              <w:top w:type="dxa" w:w="60"/>
-              <w:left w:type="dxa" w:w="90"/>
-              <w:bottom w:type="dxa" w:w="60"/>
-              <w:right w:type="dxa" w:w="90"/>
-            </w:tcMar>
-            <w:vAlign w:val="center"/>
-          </w:tcPr>
-          <w:p>
-            <w:pPr>
-              <w:jc w:val="right"/>
-            </w:pPr>
-            <w:r>
-              <w:rPr>
-                <w:b w:val="false"/>
-                <w:bCs w:val="false"/>
-                <w:sz w:val="18"/>
-                <w:szCs w:val="18"/>
-              </w:rPr>
-              <w:t xml:space="preserve">3.6</w:t>
-            </w:r>
-          </w:p>
-        </w:tc>
-        <w:tc>
-          <w:tcPr>
-            <w:tcW w:type="dxa" w:w="2680"/>
-            <w:tcBorders>
-              <w:top w:val="single" w:color="BBBBBB" w:sz="1"/>
-              <w:left w:val="single" w:color="BBBBBB" w:sz="1"/>
-              <w:bottom w:val="single" w:color="BBBBBB" w:sz="1"/>
-              <w:right w:val="single" w:color="BBBBBB" w:sz="1"/>
-            </w:tcBorders>
-            <w:shd w:fill="F8D7DA" w:val="clear"/>
-            <w:tcMar>
-              <w:top w:type="dxa" w:w="60"/>
-              <w:left w:type="dxa" w:w="90"/>
-              <w:bottom w:type="dxa" w:w="60"/>
-              <w:right w:type="dxa" w:w="90"/>
-            </w:tcMar>
-            <w:vAlign w:val="center"/>
-          </w:tcPr>
-          <w:p>
-            <w:pPr>
-              <w:jc w:val="right"/>
-            </w:pPr>
-            <w:r>
-              <w:rPr>
-                <w:b/>
-                <w:bCs/>
-                <w:sz w:val="18"/>
-                <w:szCs w:val="18"/>
-              </w:rPr>
-              <w:t xml:space="preserve">0.0</w:t>
-            </w:r>
-          </w:p>
-        </w:tc>
-      </w:tr>
-      <w:tr>
-        <w:tc>
-          <w:tcPr>
-            <w:tcW w:type="dxa" w:w="4000"/>
-            <w:tcBorders>
-              <w:top w:val="single" w:color="BBBBBB" w:sz="1"/>
-              <w:left w:val="single" w:color="BBBBBB" w:sz="1"/>
-              <w:bottom w:val="single" w:color="BBBBBB" w:sz="1"/>
-              <w:right w:val="single" w:color="BBBBBB" w:sz="1"/>
-            </w:tcBorders>
-            <w:tcMar>
-              <w:top w:type="dxa" w:w="60"/>
-              <w:left w:type="dxa" w:w="90"/>
-              <w:bottom w:type="dxa" w:w="60"/>
-              <w:right w:type="dxa" w:w="90"/>
-            </w:tcMar>
-            <w:vAlign w:val="center"/>
-          </w:tcPr>
-          <w:p>
-            <w:pPr>
-              <w:jc w:val="left"/>
-            </w:pPr>
-            <w:r>
-              <w:rPr>
-                <w:b w:val="false"/>
-                <w:bCs w:val="false"/>
-                <w:sz w:val="18"/>
-                <w:szCs w:val="18"/>
-              </w:rPr>
-              <w:t xml:space="preserve">Texto</w:t>
-            </w:r>
-          </w:p>
-        </w:tc>
-        <w:tc>
-          <w:tcPr>
-            <w:tcW w:type="dxa" w:w="2680"/>
-            <w:tcBorders>
-              <w:top w:val="single" w:color="BBBBBB" w:sz="1"/>
-              <w:left w:val="single" w:color="BBBBBB" w:sz="1"/>
-              <w:bottom w:val="single" w:color="BBBBBB" w:sz="1"/>
-              <w:right w:val="single" w:color="BBBBBB" w:sz="1"/>
-            </w:tcBorders>
-            <w:shd w:fill="DDEBD8" w:val="clear"/>
-            <w:tcMar>
-              <w:top w:type="dxa" w:w="60"/>
-              <w:left w:type="dxa" w:w="90"/>
-              <w:bottom w:type="dxa" w:w="60"/>
-              <w:right w:type="dxa" w:w="90"/>
-            </w:tcMar>
-            <w:vAlign w:val="center"/>
-          </w:tcPr>
-          <w:p>
-            <w:pPr>
-              <w:jc w:val="right"/>
-            </w:pPr>
-            <w:r>
-              <w:rPr>
-                <w:b w:val="false"/>
-                <w:bCs w:val="false"/>
-                <w:sz w:val="18"/>
-                <w:szCs w:val="18"/>
-              </w:rPr>
-              <w:t xml:space="preserve">7.4</w:t>
-            </w:r>
-          </w:p>
-        </w:tc>
-        <w:tc>
-          <w:tcPr>
-            <w:tcW w:type="dxa" w:w="2680"/>
-            <w:tcBorders>
-              <w:top w:val="single" w:color="BBBBBB" w:sz="1"/>
-              <w:left w:val="single" w:color="BBBBBB" w:sz="1"/>
-              <w:bottom w:val="single" w:color="BBBBBB" w:sz="1"/>
-              <w:right w:val="single" w:color="BBBBBB" w:sz="1"/>
-            </w:tcBorders>
-            <w:shd w:fill="DDEBD8" w:val="clear"/>
-            <w:tcMar>
-              <w:top w:type="dxa" w:w="60"/>
-              <w:left w:type="dxa" w:w="90"/>
-              <w:bottom w:type="dxa" w:w="60"/>
-              <w:right w:type="dxa" w:w="90"/>
-            </w:tcMar>
-            <w:vAlign w:val="center"/>
-          </w:tcPr>
-          <w:p>
-            <w:pPr>
-              <w:jc w:val="right"/>
-            </w:pPr>
-            <w:r>
-              <w:rPr>
-                <w:b/>
-                <w:bCs/>
-                <w:sz w:val="18"/>
-                <w:szCs w:val="18"/>
-              </w:rPr>
-              <w:t xml:space="preserve">6.2</w:t>
-            </w:r>
-          </w:p>
-        </w:tc>
-      </w:tr>
-      <w:tr>
-        <w:tc>
-          <w:tcPr>
-            <w:tcW w:type="dxa" w:w="4000"/>
-            <w:tcBorders>
-              <w:top w:val="single" w:color="BBBBBB" w:sz="1"/>
-              <w:left w:val="single" w:color="BBBBBB" w:sz="1"/>
-              <w:bottom w:val="single" w:color="BBBBBB" w:sz="1"/>
-              <w:right w:val="single" w:color="BBBBBB" w:sz="1"/>
-            </w:tcBorders>
-            <w:shd w:fill="EEF3F8" w:val="clear"/>
-            <w:tcMar>
-              <w:top w:type="dxa" w:w="60"/>
-              <w:left w:type="dxa" w:w="90"/>
-              <w:bottom w:type="dxa" w:w="60"/>
-              <w:right w:type="dxa" w:w="90"/>
-            </w:tcMar>
-            <w:vAlign w:val="center"/>
-          </w:tcPr>
-          <w:p>
-            <w:pPr>
-              <w:jc w:val="left"/>
-            </w:pPr>
-            <w:r>
-              <w:rPr>
-                <w:b w:val="false"/>
-                <w:bCs w:val="false"/>
-                <w:sz w:val="18"/>
-                <w:szCs w:val="18"/>
-              </w:rPr>
-              <w:t xml:space="preserve">Cand. híbridos</w:t>
-            </w:r>
-          </w:p>
-        </w:tc>
-        <w:tc>
-          <w:tcPr>
-            <w:tcW w:type="dxa" w:w="2680"/>
-            <w:tcBorders>
-              <w:top w:val="single" w:color="BBBBBB" w:sz="1"/>
-              <w:left w:val="single" w:color="BBBBBB" w:sz="1"/>
-              <w:bottom w:val="single" w:color="BBBBBB" w:sz="1"/>
-              <w:right w:val="single" w:color="BBBBBB" w:sz="1"/>
-            </w:tcBorders>
-            <w:shd w:fill="DDEBD8" w:val="clear"/>
-            <w:tcMar>
-              <w:top w:type="dxa" w:w="60"/>
-              <w:left w:type="dxa" w:w="90"/>
-              <w:bottom w:type="dxa" w:w="60"/>
-              <w:right w:type="dxa" w:w="90"/>
-            </w:tcMar>
-            <w:vAlign w:val="center"/>
-          </w:tcPr>
-          <w:p>
-            <w:pPr>
-              <w:jc w:val="right"/>
-            </w:pPr>
-            <w:r>
-              <w:rPr>
-                <w:b w:val="false"/>
-                <w:bCs w:val="false"/>
-                <w:sz w:val="18"/>
-                <w:szCs w:val="18"/>
-              </w:rPr>
-              <w:t xml:space="preserve">7.6</w:t>
-            </w:r>
-          </w:p>
-        </w:tc>
-        <w:tc>
-          <w:tcPr>
-            <w:tcW w:type="dxa" w:w="2680"/>
-            <w:tcBorders>
-              <w:top w:val="single" w:color="BBBBBB" w:sz="1"/>
-              <w:left w:val="single" w:color="BBBBBB" w:sz="1"/>
-              <w:bottom w:val="single" w:color="BBBBBB" w:sz="1"/>
-              <w:right w:val="single" w:color="BBBBBB" w:sz="1"/>
-            </w:tcBorders>
-            <w:shd w:fill="DDEBD8" w:val="clear"/>
-            <w:tcMar>
-              <w:top w:type="dxa" w:w="60"/>
-              <w:left w:type="dxa" w:w="90"/>
-              <w:bottom w:type="dxa" w:w="60"/>
-              <w:right w:type="dxa" w:w="90"/>
-            </w:tcMar>
-            <w:vAlign w:val="center"/>
-          </w:tcPr>
-          <w:p>
-            <w:pPr>
-              <w:jc w:val="right"/>
-            </w:pPr>
-            <w:r>
-              <w:rPr>
-                <w:b/>
-                <w:bCs/>
-                <w:sz w:val="18"/>
-                <w:szCs w:val="18"/>
-              </w:rPr>
-              <w:t xml:space="preserve">4.7</w:t>
-            </w:r>
-          </w:p>
-        </w:tc>
-      </w:tr>
-    </w:tbl>
-    <w:p>
-      <w:pPr>
-        <w:spacing w:before="120"/>
-      </w:pPr>
-      <w:r>
-        <w:rPr>
-          <w:b/>
-          <w:bCs/>
-        </w:rPr>
-        <w:t xml:space="preserve">Cold-start (autores sem coautoria em T0): os modelos topológicos ZERAM </w:t>
-      </w:r>
-      <w:r>
-        <w:t xml:space="preserve">— a vizinhança de 2 saltos é vazia, não há candidatos. Apenas o texto recomenda corretamente (Texto vs RF: +6,2pp em R@200, p=0,0009). Em cool, texto/candidatos híbridos superam o RF de forma altamente significativa (+4,0pp, p=1,2×10⁻²³).</w:t>
-      </w:r>
-    </w:p>
-    <w:p>
-      <w:pPr>
-        <w:jc w:val="center"/>
-      </w:pPr>
-      <w:r>
-        <w:drawing>
-          <wp:inline distT="0" distB="0" distL="0" distR="0">
-            <wp:extent cx="5905500" cy="2266950"/>
-            <wp:effectExtent t="0" r="0" b="0" l="0"/>
-            <wp:docPr id="1" name="ai_cool_cold.png" descr="ai_cool_cold.png" title="ai_cool_cold.png"/>
             <wp:cNvGraphicFramePr>
               <a:graphicFrameLocks xmlns:a="http://schemas.openxmlformats.org/drawingml/2006/main" noChangeAspect="1"/>
             </wp:cNvGraphicFramePr>
@@ -2909,6 +2362,685 @@
                   <pic:spPr bwMode="auto">
                     <a:xfrm>
                       <a:off x="0" y="0"/>
+                      <a:ext cx="5715000" cy="3209925"/>
+                    </a:xfrm>
+                    <a:prstGeom prst="rect">
+                      <a:avLst/>
+                    </a:prstGeom>
+                  </pic:spPr>
+                </pic:pic>
+              </a:graphicData>
+            </a:graphic>
+          </wp:inline>
+        </w:drawing>
+      </w:r>
+    </w:p>
+    <w:p>
+      <w:pPr>
+        <w:spacing w:after="120"/>
+        <w:jc w:val="center"/>
+      </w:pPr>
+      <w:r>
+        <w:rPr>
+          <w:i/>
+          <w:iCs/>
+          <w:color w:val="666666"/>
+          <w:sz w:val="16"/>
+          <w:szCs w:val="16"/>
+        </w:rPr>
+        <w:t xml:space="preserve">Figura 2 — Métricas × K (autores ativos em T0; barras = IC95%).</w:t>
+      </w:r>
+    </w:p>
+    <w:p>
+      <w:pPr>
+        <w:pStyle w:val="Heading1"/>
+      </w:pPr>
+      <w:r>
+        <w:t xml:space="preserve">6. O insight central: o espaço de candidatos</w:t>
+      </w:r>
+    </w:p>
+    <w:p>
+      <w:r>
+        <w:t xml:space="preserve">Os modelos topológicos só recomendam quem está a 2 saltos. Em redes esparsas isso alcança pouquíssimos coautores futuros; o texto traz candidatos fora da estrutura.</w:t>
+      </w:r>
+    </w:p>
+    <w:p>
+      <w:pPr>
+        <w:spacing w:before="80"/>
+        <w:jc w:val="center"/>
+      </w:pPr>
+      <w:r>
+        <w:drawing>
+          <wp:inline distT="0" distB="0" distL="0" distR="0">
+            <wp:extent cx="6096000" cy="2552700"/>
+            <wp:effectExtent t="0" r="0" b="0" l="0"/>
+            <wp:docPr id="1" name="diagrama_candidatos.png" descr="diagrama_candidatos.png" title="diagrama_candidatos.png"/>
+            <wp:cNvGraphicFramePr>
+              <a:graphicFrameLocks xmlns:a="http://schemas.openxmlformats.org/drawingml/2006/main" noChangeAspect="1"/>
+            </wp:cNvGraphicFramePr>
+            <a:graphic xmlns:a="http://schemas.openxmlformats.org/drawingml/2006/main">
+              <a:graphicData uri="http://schemas.openxmlformats.org/drawingml/2006/picture">
+                <pic:pic xmlns:pic="http://schemas.openxmlformats.org/drawingml/2006/picture">
+                  <pic:nvPicPr>
+                    <pic:cNvPr id="0" name="" descr=""/>
+                    <pic:cNvPicPr>
+                      <a:picLocks noChangeAspect="1" noChangeArrowheads="1"/>
+                    </pic:cNvPicPr>
+                  </pic:nvPicPr>
+                  <pic:blipFill>
+                    <a:blip r:embed="rId10" cstate="none"/>
+                    <a:srcRect/>
+                    <a:stretch>
+                      <a:fillRect/>
+                    </a:stretch>
+                  </pic:blipFill>
+                  <pic:spPr bwMode="auto">
+                    <a:xfrm>
+                      <a:off x="0" y="0"/>
+                      <a:ext cx="6096000" cy="2552700"/>
+                    </a:xfrm>
+                    <a:prstGeom prst="rect">
+                      <a:avLst/>
+                    </a:prstGeom>
+                  </pic:spPr>
+                </pic:pic>
+              </a:graphicData>
+            </a:graphic>
+          </wp:inline>
+        </w:drawing>
+      </w:r>
+    </w:p>
+    <w:p>
+      <w:pPr>
+        <w:spacing w:after="120"/>
+        <w:jc w:val="center"/>
+      </w:pPr>
+      <w:r>
+        <w:rPr>
+          <w:i/>
+          <w:iCs/>
+          <w:color w:val="666666"/>
+          <w:sz w:val="16"/>
+          <w:szCs w:val="16"/>
+        </w:rPr>
+        <w:t xml:space="preserve">Figura 3 — Por que o texto alcança o que a topologia não vê.</w:t>
+      </w:r>
+    </w:p>
+    <w:p>
+      <w:r>
+        <w:rPr>
+          <w:b/>
+          <w:bCs/>
+        </w:rPr>
+        <w:t xml:space="preserve">Exemplo concreto (regime cool). </w:t>
+      </w:r>
+      <w:r>
+        <w:t xml:space="preserve">O autor Icek Ajzen (3 coautores em T0) volta a colaborar, em T1, com Martin Fishbein — dupla de referência da Teoria do Comportamento Planejado. O modelo Textual recupera essa coautoria na 4ª posição; o Random Forest e o Baseline não a trazem nem no top-50, pois Fishbein está fora da vizinhança de 2 saltos de Ajzen. A afinidade temática (texto) prevê a colaboração que a estrutura não alcança.</w:t>
+      </w:r>
+    </w:p>
+    <w:p>
+      <w:pPr>
+        <w:pStyle w:val="Heading1"/>
+      </w:pPr>
+      <w:r>
+        <w:t xml:space="preserve">7. Avanço principal: cold-start</w:t>
+      </w:r>
+    </w:p>
+    <w:p>
+      <w:r>
+        <w:t xml:space="preserve">Coletamos uma base temática de IA (45.732 autores) que popula os regimes de baixa conectividade (cool n=783, cold n=53). Com poder estatístico real:</w:t>
+      </w:r>
+    </w:p>
+    <w:tbl>
+      <w:tblPr>
+        <w:tblW w:type="dxa" w:w="9360"/>
+        <w:tblBorders>
+          <w:top w:val="single" w:color="auto" w:sz="4"/>
+          <w:left w:val="single" w:color="auto" w:sz="4"/>
+          <w:bottom w:val="single" w:color="auto" w:sz="4"/>
+          <w:right w:val="single" w:color="auto" w:sz="4"/>
+          <w:insideH w:val="single" w:color="auto" w:sz="4"/>
+          <w:insideV w:val="single" w:color="auto" w:sz="4"/>
+        </w:tblBorders>
+      </w:tblPr>
+      <w:tblGrid>
+        <w:gridCol w:w="4000"/>
+        <w:gridCol w:w="2680"/>
+        <w:gridCol w:w="2680"/>
+      </w:tblGrid>
+      <w:tr>
+        <w:trPr>
+          <w:tblHeader/>
+        </w:trPr>
+        <w:tc>
+          <w:tcPr>
+            <w:tcW w:type="dxa" w:w="4000"/>
+            <w:tcBorders>
+              <w:top w:val="single" w:color="BBBBBB" w:sz="1"/>
+              <w:left w:val="single" w:color="BBBBBB" w:sz="1"/>
+              <w:bottom w:val="single" w:color="BBBBBB" w:sz="1"/>
+              <w:right w:val="single" w:color="BBBBBB" w:sz="1"/>
+            </w:tcBorders>
+            <w:shd w:fill="1F4E79" w:val="clear"/>
+            <w:tcMar>
+              <w:top w:type="dxa" w:w="60"/>
+              <w:left w:type="dxa" w:w="90"/>
+              <w:bottom w:type="dxa" w:w="60"/>
+              <w:right w:type="dxa" w:w="90"/>
+            </w:tcMar>
+            <w:vAlign w:val="center"/>
+          </w:tcPr>
+          <w:p>
+            <w:r>
+              <w:rPr>
+                <w:b/>
+                <w:bCs/>
+                <w:color w:val="FFFFFF"/>
+                <w:sz w:val="18"/>
+                <w:szCs w:val="18"/>
+              </w:rPr>
+              <w:t xml:space="preserve">Modelo</w:t>
+            </w:r>
+          </w:p>
+        </w:tc>
+        <w:tc>
+          <w:tcPr>
+            <w:tcW w:type="dxa" w:w="2680"/>
+            <w:tcBorders>
+              <w:top w:val="single" w:color="BBBBBB" w:sz="1"/>
+              <w:left w:val="single" w:color="BBBBBB" w:sz="1"/>
+              <w:bottom w:val="single" w:color="BBBBBB" w:sz="1"/>
+              <w:right w:val="single" w:color="BBBBBB" w:sz="1"/>
+            </w:tcBorders>
+            <w:shd w:fill="1F4E79" w:val="clear"/>
+            <w:tcMar>
+              <w:top w:type="dxa" w:w="60"/>
+              <w:left w:type="dxa" w:w="90"/>
+              <w:bottom w:type="dxa" w:w="60"/>
+              <w:right w:type="dxa" w:w="90"/>
+            </w:tcMar>
+            <w:vAlign w:val="center"/>
+          </w:tcPr>
+          <w:p>
+            <w:r>
+              <w:rPr>
+                <w:b/>
+                <w:bCs/>
+                <w:color w:val="FFFFFF"/>
+                <w:sz w:val="18"/>
+                <w:szCs w:val="18"/>
+              </w:rPr>
+              <w:t xml:space="preserve">cool R@200 (n=783)</w:t>
+            </w:r>
+          </w:p>
+        </w:tc>
+        <w:tc>
+          <w:tcPr>
+            <w:tcW w:type="dxa" w:w="2680"/>
+            <w:tcBorders>
+              <w:top w:val="single" w:color="BBBBBB" w:sz="1"/>
+              <w:left w:val="single" w:color="BBBBBB" w:sz="1"/>
+              <w:bottom w:val="single" w:color="BBBBBB" w:sz="1"/>
+              <w:right w:val="single" w:color="BBBBBB" w:sz="1"/>
+            </w:tcBorders>
+            <w:shd w:fill="1F4E79" w:val="clear"/>
+            <w:tcMar>
+              <w:top w:type="dxa" w:w="60"/>
+              <w:left w:type="dxa" w:w="90"/>
+              <w:bottom w:type="dxa" w:w="60"/>
+              <w:right w:type="dxa" w:w="90"/>
+            </w:tcMar>
+            <w:vAlign w:val="center"/>
+          </w:tcPr>
+          <w:p>
+            <w:r>
+              <w:rPr>
+                <w:b/>
+                <w:bCs/>
+                <w:color w:val="FFFFFF"/>
+                <w:sz w:val="18"/>
+                <w:szCs w:val="18"/>
+              </w:rPr>
+              <w:t xml:space="preserve">cold R@200 (n=53)</w:t>
+            </w:r>
+          </w:p>
+        </w:tc>
+      </w:tr>
+      <w:tr>
+        <w:tc>
+          <w:tcPr>
+            <w:tcW w:type="dxa" w:w="4000"/>
+            <w:tcBorders>
+              <w:top w:val="single" w:color="BBBBBB" w:sz="1"/>
+              <w:left w:val="single" w:color="BBBBBB" w:sz="1"/>
+              <w:bottom w:val="single" w:color="BBBBBB" w:sz="1"/>
+              <w:right w:val="single" w:color="BBBBBB" w:sz="1"/>
+            </w:tcBorders>
+            <w:tcMar>
+              <w:top w:type="dxa" w:w="60"/>
+              <w:left w:type="dxa" w:w="90"/>
+              <w:bottom w:type="dxa" w:w="60"/>
+              <w:right w:type="dxa" w:w="90"/>
+            </w:tcMar>
+            <w:vAlign w:val="center"/>
+          </w:tcPr>
+          <w:p>
+            <w:pPr>
+              <w:jc w:val="left"/>
+            </w:pPr>
+            <w:r>
+              <w:rPr>
+                <w:b w:val="false"/>
+                <w:bCs w:val="false"/>
+                <w:sz w:val="18"/>
+                <w:szCs w:val="18"/>
+              </w:rPr>
+              <w:t xml:space="preserve">Baseline (CN)</w:t>
+            </w:r>
+          </w:p>
+        </w:tc>
+        <w:tc>
+          <w:tcPr>
+            <w:tcW w:type="dxa" w:w="2680"/>
+            <w:tcBorders>
+              <w:top w:val="single" w:color="BBBBBB" w:sz="1"/>
+              <w:left w:val="single" w:color="BBBBBB" w:sz="1"/>
+              <w:bottom w:val="single" w:color="BBBBBB" w:sz="1"/>
+              <w:right w:val="single" w:color="BBBBBB" w:sz="1"/>
+            </w:tcBorders>
+            <w:tcMar>
+              <w:top w:type="dxa" w:w="60"/>
+              <w:left w:type="dxa" w:w="90"/>
+              <w:bottom w:type="dxa" w:w="60"/>
+              <w:right w:type="dxa" w:w="90"/>
+            </w:tcMar>
+            <w:vAlign w:val="center"/>
+          </w:tcPr>
+          <w:p>
+            <w:pPr>
+              <w:jc w:val="right"/>
+            </w:pPr>
+            <w:r>
+              <w:rPr>
+                <w:b w:val="false"/>
+                <w:bCs w:val="false"/>
+                <w:sz w:val="18"/>
+                <w:szCs w:val="18"/>
+              </w:rPr>
+              <w:t xml:space="preserve">1.3</w:t>
+            </w:r>
+          </w:p>
+        </w:tc>
+        <w:tc>
+          <w:tcPr>
+            <w:tcW w:type="dxa" w:w="2680"/>
+            <w:tcBorders>
+              <w:top w:val="single" w:color="BBBBBB" w:sz="1"/>
+              <w:left w:val="single" w:color="BBBBBB" w:sz="1"/>
+              <w:bottom w:val="single" w:color="BBBBBB" w:sz="1"/>
+              <w:right w:val="single" w:color="BBBBBB" w:sz="1"/>
+            </w:tcBorders>
+            <w:shd w:fill="F8D7DA" w:val="clear"/>
+            <w:tcMar>
+              <w:top w:type="dxa" w:w="60"/>
+              <w:left w:type="dxa" w:w="90"/>
+              <w:bottom w:type="dxa" w:w="60"/>
+              <w:right w:type="dxa" w:w="90"/>
+            </w:tcMar>
+            <w:vAlign w:val="center"/>
+          </w:tcPr>
+          <w:p>
+            <w:pPr>
+              <w:jc w:val="right"/>
+            </w:pPr>
+            <w:r>
+              <w:rPr>
+                <w:b/>
+                <w:bCs/>
+                <w:sz w:val="18"/>
+                <w:szCs w:val="18"/>
+              </w:rPr>
+              <w:t xml:space="preserve">0.0</w:t>
+            </w:r>
+          </w:p>
+        </w:tc>
+      </w:tr>
+      <w:tr>
+        <w:tc>
+          <w:tcPr>
+            <w:tcW w:type="dxa" w:w="4000"/>
+            <w:tcBorders>
+              <w:top w:val="single" w:color="BBBBBB" w:sz="1"/>
+              <w:left w:val="single" w:color="BBBBBB" w:sz="1"/>
+              <w:bottom w:val="single" w:color="BBBBBB" w:sz="1"/>
+              <w:right w:val="single" w:color="BBBBBB" w:sz="1"/>
+            </w:tcBorders>
+            <w:shd w:fill="EEF3F8" w:val="clear"/>
+            <w:tcMar>
+              <w:top w:type="dxa" w:w="60"/>
+              <w:left w:type="dxa" w:w="90"/>
+              <w:bottom w:type="dxa" w:w="60"/>
+              <w:right w:type="dxa" w:w="90"/>
+            </w:tcMar>
+            <w:vAlign w:val="center"/>
+          </w:tcPr>
+          <w:p>
+            <w:pPr>
+              <w:jc w:val="left"/>
+            </w:pPr>
+            <w:r>
+              <w:rPr>
+                <w:b w:val="false"/>
+                <w:bCs w:val="false"/>
+                <w:sz w:val="18"/>
+                <w:szCs w:val="18"/>
+              </w:rPr>
+              <w:t xml:space="preserve">Híbrido RF</w:t>
+            </w:r>
+          </w:p>
+        </w:tc>
+        <w:tc>
+          <w:tcPr>
+            <w:tcW w:type="dxa" w:w="2680"/>
+            <w:tcBorders>
+              <w:top w:val="single" w:color="BBBBBB" w:sz="1"/>
+              <w:left w:val="single" w:color="BBBBBB" w:sz="1"/>
+              <w:bottom w:val="single" w:color="BBBBBB" w:sz="1"/>
+              <w:right w:val="single" w:color="BBBBBB" w:sz="1"/>
+            </w:tcBorders>
+            <w:shd w:fill="EEF3F8" w:val="clear"/>
+            <w:tcMar>
+              <w:top w:type="dxa" w:w="60"/>
+              <w:left w:type="dxa" w:w="90"/>
+              <w:bottom w:type="dxa" w:w="60"/>
+              <w:right w:type="dxa" w:w="90"/>
+            </w:tcMar>
+            <w:vAlign w:val="center"/>
+          </w:tcPr>
+          <w:p>
+            <w:pPr>
+              <w:jc w:val="right"/>
+            </w:pPr>
+            <w:r>
+              <w:rPr>
+                <w:b w:val="false"/>
+                <w:bCs w:val="false"/>
+                <w:sz w:val="18"/>
+                <w:szCs w:val="18"/>
+              </w:rPr>
+              <w:t xml:space="preserve">3.6</w:t>
+            </w:r>
+          </w:p>
+        </w:tc>
+        <w:tc>
+          <w:tcPr>
+            <w:tcW w:type="dxa" w:w="2680"/>
+            <w:tcBorders>
+              <w:top w:val="single" w:color="BBBBBB" w:sz="1"/>
+              <w:left w:val="single" w:color="BBBBBB" w:sz="1"/>
+              <w:bottom w:val="single" w:color="BBBBBB" w:sz="1"/>
+              <w:right w:val="single" w:color="BBBBBB" w:sz="1"/>
+            </w:tcBorders>
+            <w:shd w:fill="F8D7DA" w:val="clear"/>
+            <w:tcMar>
+              <w:top w:type="dxa" w:w="60"/>
+              <w:left w:type="dxa" w:w="90"/>
+              <w:bottom w:type="dxa" w:w="60"/>
+              <w:right w:type="dxa" w:w="90"/>
+            </w:tcMar>
+            <w:vAlign w:val="center"/>
+          </w:tcPr>
+          <w:p>
+            <w:pPr>
+              <w:jc w:val="right"/>
+            </w:pPr>
+            <w:r>
+              <w:rPr>
+                <w:b/>
+                <w:bCs/>
+                <w:sz w:val="18"/>
+                <w:szCs w:val="18"/>
+              </w:rPr>
+              <w:t xml:space="preserve">0.0</w:t>
+            </w:r>
+          </w:p>
+        </w:tc>
+      </w:tr>
+      <w:tr>
+        <w:tc>
+          <w:tcPr>
+            <w:tcW w:type="dxa" w:w="4000"/>
+            <w:tcBorders>
+              <w:top w:val="single" w:color="BBBBBB" w:sz="1"/>
+              <w:left w:val="single" w:color="BBBBBB" w:sz="1"/>
+              <w:bottom w:val="single" w:color="BBBBBB" w:sz="1"/>
+              <w:right w:val="single" w:color="BBBBBB" w:sz="1"/>
+            </w:tcBorders>
+            <w:tcMar>
+              <w:top w:type="dxa" w:w="60"/>
+              <w:left w:type="dxa" w:w="90"/>
+              <w:bottom w:type="dxa" w:w="60"/>
+              <w:right w:type="dxa" w:w="90"/>
+            </w:tcMar>
+            <w:vAlign w:val="center"/>
+          </w:tcPr>
+          <w:p>
+            <w:pPr>
+              <w:jc w:val="left"/>
+            </w:pPr>
+            <w:r>
+              <w:rPr>
+                <w:b w:val="false"/>
+                <w:bCs w:val="false"/>
+                <w:sz w:val="18"/>
+                <w:szCs w:val="18"/>
+              </w:rPr>
+              <w:t xml:space="preserve">Texto</w:t>
+            </w:r>
+          </w:p>
+        </w:tc>
+        <w:tc>
+          <w:tcPr>
+            <w:tcW w:type="dxa" w:w="2680"/>
+            <w:tcBorders>
+              <w:top w:val="single" w:color="BBBBBB" w:sz="1"/>
+              <w:left w:val="single" w:color="BBBBBB" w:sz="1"/>
+              <w:bottom w:val="single" w:color="BBBBBB" w:sz="1"/>
+              <w:right w:val="single" w:color="BBBBBB" w:sz="1"/>
+            </w:tcBorders>
+            <w:shd w:fill="DDEBD8" w:val="clear"/>
+            <w:tcMar>
+              <w:top w:type="dxa" w:w="60"/>
+              <w:left w:type="dxa" w:w="90"/>
+              <w:bottom w:type="dxa" w:w="60"/>
+              <w:right w:type="dxa" w:w="90"/>
+            </w:tcMar>
+            <w:vAlign w:val="center"/>
+          </w:tcPr>
+          <w:p>
+            <w:pPr>
+              <w:jc w:val="right"/>
+            </w:pPr>
+            <w:r>
+              <w:rPr>
+                <w:b w:val="false"/>
+                <w:bCs w:val="false"/>
+                <w:sz w:val="18"/>
+                <w:szCs w:val="18"/>
+              </w:rPr>
+              <w:t xml:space="preserve">7.4</w:t>
+            </w:r>
+          </w:p>
+        </w:tc>
+        <w:tc>
+          <w:tcPr>
+            <w:tcW w:type="dxa" w:w="2680"/>
+            <w:tcBorders>
+              <w:top w:val="single" w:color="BBBBBB" w:sz="1"/>
+              <w:left w:val="single" w:color="BBBBBB" w:sz="1"/>
+              <w:bottom w:val="single" w:color="BBBBBB" w:sz="1"/>
+              <w:right w:val="single" w:color="BBBBBB" w:sz="1"/>
+            </w:tcBorders>
+            <w:shd w:fill="DDEBD8" w:val="clear"/>
+            <w:tcMar>
+              <w:top w:type="dxa" w:w="60"/>
+              <w:left w:type="dxa" w:w="90"/>
+              <w:bottom w:type="dxa" w:w="60"/>
+              <w:right w:type="dxa" w:w="90"/>
+            </w:tcMar>
+            <w:vAlign w:val="center"/>
+          </w:tcPr>
+          <w:p>
+            <w:pPr>
+              <w:jc w:val="right"/>
+            </w:pPr>
+            <w:r>
+              <w:rPr>
+                <w:b/>
+                <w:bCs/>
+                <w:sz w:val="18"/>
+                <w:szCs w:val="18"/>
+              </w:rPr>
+              <w:t xml:space="preserve">6.2</w:t>
+            </w:r>
+          </w:p>
+        </w:tc>
+      </w:tr>
+      <w:tr>
+        <w:tc>
+          <w:tcPr>
+            <w:tcW w:type="dxa" w:w="4000"/>
+            <w:tcBorders>
+              <w:top w:val="single" w:color="BBBBBB" w:sz="1"/>
+              <w:left w:val="single" w:color="BBBBBB" w:sz="1"/>
+              <w:bottom w:val="single" w:color="BBBBBB" w:sz="1"/>
+              <w:right w:val="single" w:color="BBBBBB" w:sz="1"/>
+            </w:tcBorders>
+            <w:shd w:fill="EEF3F8" w:val="clear"/>
+            <w:tcMar>
+              <w:top w:type="dxa" w:w="60"/>
+              <w:left w:type="dxa" w:w="90"/>
+              <w:bottom w:type="dxa" w:w="60"/>
+              <w:right w:type="dxa" w:w="90"/>
+            </w:tcMar>
+            <w:vAlign w:val="center"/>
+          </w:tcPr>
+          <w:p>
+            <w:pPr>
+              <w:jc w:val="left"/>
+            </w:pPr>
+            <w:r>
+              <w:rPr>
+                <w:b w:val="false"/>
+                <w:bCs w:val="false"/>
+                <w:sz w:val="18"/>
+                <w:szCs w:val="18"/>
+              </w:rPr>
+              <w:t xml:space="preserve">Cand. híbridos</w:t>
+            </w:r>
+          </w:p>
+        </w:tc>
+        <w:tc>
+          <w:tcPr>
+            <w:tcW w:type="dxa" w:w="2680"/>
+            <w:tcBorders>
+              <w:top w:val="single" w:color="BBBBBB" w:sz="1"/>
+              <w:left w:val="single" w:color="BBBBBB" w:sz="1"/>
+              <w:bottom w:val="single" w:color="BBBBBB" w:sz="1"/>
+              <w:right w:val="single" w:color="BBBBBB" w:sz="1"/>
+            </w:tcBorders>
+            <w:shd w:fill="DDEBD8" w:val="clear"/>
+            <w:tcMar>
+              <w:top w:type="dxa" w:w="60"/>
+              <w:left w:type="dxa" w:w="90"/>
+              <w:bottom w:type="dxa" w:w="60"/>
+              <w:right w:type="dxa" w:w="90"/>
+            </w:tcMar>
+            <w:vAlign w:val="center"/>
+          </w:tcPr>
+          <w:p>
+            <w:pPr>
+              <w:jc w:val="right"/>
+            </w:pPr>
+            <w:r>
+              <w:rPr>
+                <w:b w:val="false"/>
+                <w:bCs w:val="false"/>
+                <w:sz w:val="18"/>
+                <w:szCs w:val="18"/>
+              </w:rPr>
+              <w:t xml:space="preserve">7.6</w:t>
+            </w:r>
+          </w:p>
+        </w:tc>
+        <w:tc>
+          <w:tcPr>
+            <w:tcW w:type="dxa" w:w="2680"/>
+            <w:tcBorders>
+              <w:top w:val="single" w:color="BBBBBB" w:sz="1"/>
+              <w:left w:val="single" w:color="BBBBBB" w:sz="1"/>
+              <w:bottom w:val="single" w:color="BBBBBB" w:sz="1"/>
+              <w:right w:val="single" w:color="BBBBBB" w:sz="1"/>
+            </w:tcBorders>
+            <w:shd w:fill="DDEBD8" w:val="clear"/>
+            <w:tcMar>
+              <w:top w:type="dxa" w:w="60"/>
+              <w:left w:type="dxa" w:w="90"/>
+              <w:bottom w:type="dxa" w:w="60"/>
+              <w:right w:type="dxa" w:w="90"/>
+            </w:tcMar>
+            <w:vAlign w:val="center"/>
+          </w:tcPr>
+          <w:p>
+            <w:pPr>
+              <w:jc w:val="right"/>
+            </w:pPr>
+            <w:r>
+              <w:rPr>
+                <w:b/>
+                <w:bCs/>
+                <w:sz w:val="18"/>
+                <w:szCs w:val="18"/>
+              </w:rPr>
+              <w:t xml:space="preserve">4.7</w:t>
+            </w:r>
+          </w:p>
+        </w:tc>
+      </w:tr>
+    </w:tbl>
+    <w:p>
+      <w:pPr>
+        <w:spacing w:before="80"/>
+        <w:jc w:val="center"/>
+      </w:pPr>
+      <w:r>
+        <w:drawing>
+          <wp:inline distT="0" distB="0" distL="0" distR="0">
+            <wp:extent cx="5905500" cy="2266950"/>
+            <wp:effectExtent t="0" r="0" b="0" l="0"/>
+            <wp:docPr id="1" name="ai_cool_cold.png" descr="ai_cool_cold.png" title="ai_cool_cold.png"/>
+            <wp:cNvGraphicFramePr>
+              <a:graphicFrameLocks xmlns:a="http://schemas.openxmlformats.org/drawingml/2006/main" noChangeAspect="1"/>
+            </wp:cNvGraphicFramePr>
+            <a:graphic xmlns:a="http://schemas.openxmlformats.org/drawingml/2006/main">
+              <a:graphicData uri="http://schemas.openxmlformats.org/drawingml/2006/picture">
+                <pic:pic xmlns:pic="http://schemas.openxmlformats.org/drawingml/2006/picture">
+                  <pic:nvPicPr>
+                    <pic:cNvPr id="0" name="" descr=""/>
+                    <pic:cNvPicPr>
+                      <a:picLocks noChangeAspect="1" noChangeArrowheads="1"/>
+                    </pic:cNvPicPr>
+                  </pic:nvPicPr>
+                  <pic:blipFill>
+                    <a:blip r:embed="rId11" cstate="none"/>
+                    <a:srcRect/>
+                    <a:stretch>
+                      <a:fillRect/>
+                    </a:stretch>
+                  </pic:blipFill>
+                  <pic:spPr bwMode="auto">
+                    <a:xfrm>
+                      <a:off x="0" y="0"/>
                       <a:ext cx="5905500" cy="2266950"/>
                     </a:xfrm>
                     <a:prstGeom prst="rect">
@@ -2924,10 +3056,1789 @@
     </w:p>
     <w:p>
       <w:pPr>
+        <w:spacing w:after="120"/>
+        <w:jc w:val="center"/>
+      </w:pPr>
+      <w:r>
+        <w:rPr>
+          <w:i/>
+          <w:iCs/>
+          <w:color w:val="666666"/>
+          <w:sz w:val="16"/>
+          <w:szCs w:val="16"/>
+        </w:rPr>
+        <w:t xml:space="preserve">Figura 4 — Recall@K por regime (base de IA). No cold, topologia ≈ 0; só o texto sobe.</w:t>
+      </w:r>
+    </w:p>
+    <w:p>
+      <w:r>
+        <w:t xml:space="preserve">No cold-start os modelos topológicos zeram (vizinhança vazia); apenas o texto recomenda (Texto vs RF +6,2pp, p=0,0009). Em cool, texto/híbridos superam o RF (+4,0pp, p=1,2×10⁻²³).</w:t>
+      </w:r>
+    </w:p>
+    <w:p>
+      <w:pPr>
         <w:pStyle w:val="Heading1"/>
       </w:pPr>
       <w:r>
-        <w:t xml:space="preserve">6. Avanços encontrados (síntese)</w:t>
+        <w:t xml:space="preserve">8. Experimentos de validação</w:t>
+      </w:r>
+    </w:p>
+    <w:p>
+      <w:r>
+        <w:rPr>
+          <w:b/>
+          <w:bCs/>
+        </w:rPr>
+        <w:t xml:space="preserve">8.1 Compensa ir para 3 saltos? </w:t>
+      </w:r>
+      <w:r>
+        <w:t xml:space="preserve">Medindo o alcance (fração de coautores futuros no pool) e o custo (tamanho do pool):</w:t>
+      </w:r>
+    </w:p>
+    <w:tbl>
+      <w:tblPr>
+        <w:tblW w:type="dxa" w:w="9360"/>
+        <w:tblBorders>
+          <w:top w:val="single" w:color="auto" w:sz="4"/>
+          <w:left w:val="single" w:color="auto" w:sz="4"/>
+          <w:bottom w:val="single" w:color="auto" w:sz="4"/>
+          <w:right w:val="single" w:color="auto" w:sz="4"/>
+          <w:insideH w:val="single" w:color="auto" w:sz="4"/>
+          <w:insideV w:val="single" w:color="auto" w:sz="4"/>
+        </w:tblBorders>
+      </w:tblPr>
+      <w:tblGrid>
+        <w:gridCol w:w="2200"/>
+        <w:gridCol w:w="1790"/>
+        <w:gridCol w:w="1790"/>
+        <w:gridCol w:w="1790"/>
+        <w:gridCol w:w="1790"/>
+      </w:tblGrid>
+      <w:tr>
+        <w:trPr>
+          <w:tblHeader/>
+        </w:trPr>
+        <w:tc>
+          <w:tcPr>
+            <w:tcW w:type="dxa" w:w="2200"/>
+            <w:tcBorders>
+              <w:top w:val="single" w:color="BBBBBB" w:sz="1"/>
+              <w:left w:val="single" w:color="BBBBBB" w:sz="1"/>
+              <w:bottom w:val="single" w:color="BBBBBB" w:sz="1"/>
+              <w:right w:val="single" w:color="BBBBBB" w:sz="1"/>
+            </w:tcBorders>
+            <w:shd w:fill="1F4E79" w:val="clear"/>
+            <w:tcMar>
+              <w:top w:type="dxa" w:w="60"/>
+              <w:left w:type="dxa" w:w="90"/>
+              <w:bottom w:type="dxa" w:w="60"/>
+              <w:right w:type="dxa" w:w="90"/>
+            </w:tcMar>
+            <w:vAlign w:val="center"/>
+          </w:tcPr>
+          <w:p>
+            <w:r>
+              <w:rPr>
+                <w:b/>
+                <w:bCs/>
+                <w:color w:val="FFFFFF"/>
+                <w:sz w:val="18"/>
+                <w:szCs w:val="18"/>
+              </w:rPr>
+              <w:t xml:space="preserve">regime</w:t>
+            </w:r>
+          </w:p>
+        </w:tc>
+        <w:tc>
+          <w:tcPr>
+            <w:tcW w:type="dxa" w:w="1790"/>
+            <w:tcBorders>
+              <w:top w:val="single" w:color="BBBBBB" w:sz="1"/>
+              <w:left w:val="single" w:color="BBBBBB" w:sz="1"/>
+              <w:bottom w:val="single" w:color="BBBBBB" w:sz="1"/>
+              <w:right w:val="single" w:color="BBBBBB" w:sz="1"/>
+            </w:tcBorders>
+            <w:shd w:fill="1F4E79" w:val="clear"/>
+            <w:tcMar>
+              <w:top w:type="dxa" w:w="60"/>
+              <w:left w:type="dxa" w:w="90"/>
+              <w:bottom w:type="dxa" w:w="60"/>
+              <w:right w:type="dxa" w:w="90"/>
+            </w:tcMar>
+            <w:vAlign w:val="center"/>
+          </w:tcPr>
+          <w:p>
+            <w:r>
+              <w:rPr>
+                <w:b/>
+                <w:bCs/>
+                <w:color w:val="FFFFFF"/>
+                <w:sz w:val="18"/>
+                <w:szCs w:val="18"/>
+              </w:rPr>
+              <w:t xml:space="preserve">alcance 2-hop</w:t>
+            </w:r>
+          </w:p>
+        </w:tc>
+        <w:tc>
+          <w:tcPr>
+            <w:tcW w:type="dxa" w:w="1790"/>
+            <w:tcBorders>
+              <w:top w:val="single" w:color="BBBBBB" w:sz="1"/>
+              <w:left w:val="single" w:color="BBBBBB" w:sz="1"/>
+              <w:bottom w:val="single" w:color="BBBBBB" w:sz="1"/>
+              <w:right w:val="single" w:color="BBBBBB" w:sz="1"/>
+            </w:tcBorders>
+            <w:shd w:fill="1F4E79" w:val="clear"/>
+            <w:tcMar>
+              <w:top w:type="dxa" w:w="60"/>
+              <w:left w:type="dxa" w:w="90"/>
+              <w:bottom w:type="dxa" w:w="60"/>
+              <w:right w:type="dxa" w:w="90"/>
+            </w:tcMar>
+            <w:vAlign w:val="center"/>
+          </w:tcPr>
+          <w:p>
+            <w:r>
+              <w:rPr>
+                <w:b/>
+                <w:bCs/>
+                <w:color w:val="FFFFFF"/>
+                <w:sz w:val="18"/>
+                <w:szCs w:val="18"/>
+              </w:rPr>
+              <w:t xml:space="preserve">alcance 3-hop</w:t>
+            </w:r>
+          </w:p>
+        </w:tc>
+        <w:tc>
+          <w:tcPr>
+            <w:tcW w:type="dxa" w:w="1790"/>
+            <w:tcBorders>
+              <w:top w:val="single" w:color="BBBBBB" w:sz="1"/>
+              <w:left w:val="single" w:color="BBBBBB" w:sz="1"/>
+              <w:bottom w:val="single" w:color="BBBBBB" w:sz="1"/>
+              <w:right w:val="single" w:color="BBBBBB" w:sz="1"/>
+            </w:tcBorders>
+            <w:shd w:fill="1F4E79" w:val="clear"/>
+            <w:tcMar>
+              <w:top w:type="dxa" w:w="60"/>
+              <w:left w:type="dxa" w:w="90"/>
+              <w:bottom w:type="dxa" w:w="60"/>
+              <w:right w:type="dxa" w:w="90"/>
+            </w:tcMar>
+            <w:vAlign w:val="center"/>
+          </w:tcPr>
+          <w:p>
+            <w:r>
+              <w:rPr>
+                <w:b/>
+                <w:bCs/>
+                <w:color w:val="FFFFFF"/>
+                <w:sz w:val="18"/>
+                <w:szCs w:val="18"/>
+              </w:rPr>
+              <w:t xml:space="preserve">pool 2-hop</w:t>
+            </w:r>
+          </w:p>
+        </w:tc>
+        <w:tc>
+          <w:tcPr>
+            <w:tcW w:type="dxa" w:w="1790"/>
+            <w:tcBorders>
+              <w:top w:val="single" w:color="BBBBBB" w:sz="1"/>
+              <w:left w:val="single" w:color="BBBBBB" w:sz="1"/>
+              <w:bottom w:val="single" w:color="BBBBBB" w:sz="1"/>
+              <w:right w:val="single" w:color="BBBBBB" w:sz="1"/>
+            </w:tcBorders>
+            <w:shd w:fill="1F4E79" w:val="clear"/>
+            <w:tcMar>
+              <w:top w:type="dxa" w:w="60"/>
+              <w:left w:type="dxa" w:w="90"/>
+              <w:bottom w:type="dxa" w:w="60"/>
+              <w:right w:type="dxa" w:w="90"/>
+            </w:tcMar>
+            <w:vAlign w:val="center"/>
+          </w:tcPr>
+          <w:p>
+            <w:r>
+              <w:rPr>
+                <w:b/>
+                <w:bCs/>
+                <w:color w:val="FFFFFF"/>
+                <w:sz w:val="18"/>
+                <w:szCs w:val="18"/>
+              </w:rPr>
+              <w:t xml:space="preserve">pool 3-hop</w:t>
+            </w:r>
+          </w:p>
+        </w:tc>
+      </w:tr>
+      <w:tr>
+        <w:tc>
+          <w:tcPr>
+            <w:tcW w:type="dxa" w:w="2200"/>
+            <w:tcBorders>
+              <w:top w:val="single" w:color="BBBBBB" w:sz="1"/>
+              <w:left w:val="single" w:color="BBBBBB" w:sz="1"/>
+              <w:bottom w:val="single" w:color="BBBBBB" w:sz="1"/>
+              <w:right w:val="single" w:color="BBBBBB" w:sz="1"/>
+            </w:tcBorders>
+            <w:tcMar>
+              <w:top w:type="dxa" w:w="60"/>
+              <w:left w:type="dxa" w:w="90"/>
+              <w:bottom w:type="dxa" w:w="60"/>
+              <w:right w:type="dxa" w:w="90"/>
+            </w:tcMar>
+            <w:vAlign w:val="center"/>
+          </w:tcPr>
+          <w:p>
+            <w:pPr>
+              <w:jc w:val="left"/>
+            </w:pPr>
+            <w:r>
+              <w:rPr>
+                <w:b/>
+                <w:bCs/>
+                <w:sz w:val="18"/>
+                <w:szCs w:val="18"/>
+              </w:rPr>
+              <w:t xml:space="preserve">geral</w:t>
+            </w:r>
+          </w:p>
+        </w:tc>
+        <w:tc>
+          <w:tcPr>
+            <w:tcW w:type="dxa" w:w="1790"/>
+            <w:tcBorders>
+              <w:top w:val="single" w:color="BBBBBB" w:sz="1"/>
+              <w:left w:val="single" w:color="BBBBBB" w:sz="1"/>
+              <w:bottom w:val="single" w:color="BBBBBB" w:sz="1"/>
+              <w:right w:val="single" w:color="BBBBBB" w:sz="1"/>
+            </w:tcBorders>
+            <w:tcMar>
+              <w:top w:type="dxa" w:w="60"/>
+              <w:left w:type="dxa" w:w="90"/>
+              <w:bottom w:type="dxa" w:w="60"/>
+              <w:right w:type="dxa" w:w="90"/>
+            </w:tcMar>
+            <w:vAlign w:val="center"/>
+          </w:tcPr>
+          <w:p>
+            <w:pPr>
+              <w:jc w:val="left"/>
+            </w:pPr>
+            <w:r>
+              <w:rPr>
+                <w:b/>
+                <w:bCs/>
+                <w:sz w:val="18"/>
+                <w:szCs w:val="18"/>
+              </w:rPr>
+              <w:t xml:space="preserve">3,5%</w:t>
+            </w:r>
+          </w:p>
+        </w:tc>
+        <w:tc>
+          <w:tcPr>
+            <w:tcW w:type="dxa" w:w="1790"/>
+            <w:tcBorders>
+              <w:top w:val="single" w:color="BBBBBB" w:sz="1"/>
+              <w:left w:val="single" w:color="BBBBBB" w:sz="1"/>
+              <w:bottom w:val="single" w:color="BBBBBB" w:sz="1"/>
+              <w:right w:val="single" w:color="BBBBBB" w:sz="1"/>
+            </w:tcBorders>
+            <w:tcMar>
+              <w:top w:type="dxa" w:w="60"/>
+              <w:left w:type="dxa" w:w="90"/>
+              <w:bottom w:type="dxa" w:w="60"/>
+              <w:right w:type="dxa" w:w="90"/>
+            </w:tcMar>
+            <w:vAlign w:val="center"/>
+          </w:tcPr>
+          <w:p>
+            <w:pPr>
+              <w:jc w:val="left"/>
+            </w:pPr>
+            <w:r>
+              <w:rPr>
+                <w:b/>
+                <w:bCs/>
+                <w:sz w:val="18"/>
+                <w:szCs w:val="18"/>
+              </w:rPr>
+              <w:t xml:space="preserve">4,9%</w:t>
+            </w:r>
+          </w:p>
+        </w:tc>
+        <w:tc>
+          <w:tcPr>
+            <w:tcW w:type="dxa" w:w="1790"/>
+            <w:tcBorders>
+              <w:top w:val="single" w:color="BBBBBB" w:sz="1"/>
+              <w:left w:val="single" w:color="BBBBBB" w:sz="1"/>
+              <w:bottom w:val="single" w:color="BBBBBB" w:sz="1"/>
+              <w:right w:val="single" w:color="BBBBBB" w:sz="1"/>
+            </w:tcBorders>
+            <w:tcMar>
+              <w:top w:type="dxa" w:w="60"/>
+              <w:left w:type="dxa" w:w="90"/>
+              <w:bottom w:type="dxa" w:w="60"/>
+              <w:right w:type="dxa" w:w="90"/>
+            </w:tcMar>
+            <w:vAlign w:val="center"/>
+          </w:tcPr>
+          <w:p>
+            <w:pPr>
+              <w:jc w:val="left"/>
+            </w:pPr>
+            <w:r>
+              <w:rPr>
+                <w:b/>
+                <w:bCs/>
+                <w:sz w:val="18"/>
+                <w:szCs w:val="18"/>
+              </w:rPr>
+              <w:t xml:space="preserve">22</w:t>
+            </w:r>
+          </w:p>
+        </w:tc>
+        <w:tc>
+          <w:tcPr>
+            <w:tcW w:type="dxa" w:w="1790"/>
+            <w:tcBorders>
+              <w:top w:val="single" w:color="BBBBBB" w:sz="1"/>
+              <w:left w:val="single" w:color="BBBBBB" w:sz="1"/>
+              <w:bottom w:val="single" w:color="BBBBBB" w:sz="1"/>
+              <w:right w:val="single" w:color="BBBBBB" w:sz="1"/>
+            </w:tcBorders>
+            <w:tcMar>
+              <w:top w:type="dxa" w:w="60"/>
+              <w:left w:type="dxa" w:w="90"/>
+              <w:bottom w:type="dxa" w:w="60"/>
+              <w:right w:type="dxa" w:w="90"/>
+            </w:tcMar>
+            <w:vAlign w:val="center"/>
+          </w:tcPr>
+          <w:p>
+            <w:pPr>
+              <w:jc w:val="left"/>
+            </w:pPr>
+            <w:r>
+              <w:rPr>
+                <w:b/>
+                <w:bCs/>
+                <w:sz w:val="18"/>
+                <w:szCs w:val="18"/>
+              </w:rPr>
+              <w:t xml:space="preserve">82</w:t>
+            </w:r>
+          </w:p>
+        </w:tc>
+      </w:tr>
+      <w:tr>
+        <w:tc>
+          <w:tcPr>
+            <w:tcW w:type="dxa" w:w="2200"/>
+            <w:tcBorders>
+              <w:top w:val="single" w:color="BBBBBB" w:sz="1"/>
+              <w:left w:val="single" w:color="BBBBBB" w:sz="1"/>
+              <w:bottom w:val="single" w:color="BBBBBB" w:sz="1"/>
+              <w:right w:val="single" w:color="BBBBBB" w:sz="1"/>
+            </w:tcBorders>
+            <w:shd w:fill="EEF3F8" w:val="clear"/>
+            <w:tcMar>
+              <w:top w:type="dxa" w:w="60"/>
+              <w:left w:type="dxa" w:w="90"/>
+              <w:bottom w:type="dxa" w:w="60"/>
+              <w:right w:type="dxa" w:w="90"/>
+            </w:tcMar>
+            <w:vAlign w:val="center"/>
+          </w:tcPr>
+          <w:p>
+            <w:pPr>
+              <w:jc w:val="left"/>
+            </w:pPr>
+            <w:r>
+              <w:rPr>
+                <w:b/>
+                <w:bCs/>
+                <w:sz w:val="18"/>
+                <w:szCs w:val="18"/>
+              </w:rPr>
+              <w:t xml:space="preserve">warm</w:t>
+            </w:r>
+          </w:p>
+        </w:tc>
+        <w:tc>
+          <w:tcPr>
+            <w:tcW w:type="dxa" w:w="1790"/>
+            <w:tcBorders>
+              <w:top w:val="single" w:color="BBBBBB" w:sz="1"/>
+              <w:left w:val="single" w:color="BBBBBB" w:sz="1"/>
+              <w:bottom w:val="single" w:color="BBBBBB" w:sz="1"/>
+              <w:right w:val="single" w:color="BBBBBB" w:sz="1"/>
+            </w:tcBorders>
+            <w:shd w:fill="EEF3F8" w:val="clear"/>
+            <w:tcMar>
+              <w:top w:type="dxa" w:w="60"/>
+              <w:left w:type="dxa" w:w="90"/>
+              <w:bottom w:type="dxa" w:w="60"/>
+              <w:right w:type="dxa" w:w="90"/>
+            </w:tcMar>
+            <w:vAlign w:val="center"/>
+          </w:tcPr>
+          <w:p>
+            <w:pPr>
+              <w:jc w:val="left"/>
+            </w:pPr>
+            <w:r>
+              <w:rPr>
+                <w:b/>
+                <w:bCs/>
+                <w:sz w:val="18"/>
+                <w:szCs w:val="18"/>
+              </w:rPr>
+              <w:t xml:space="preserve">3,8%</w:t>
+            </w:r>
+          </w:p>
+        </w:tc>
+        <w:tc>
+          <w:tcPr>
+            <w:tcW w:type="dxa" w:w="1790"/>
+            <w:tcBorders>
+              <w:top w:val="single" w:color="BBBBBB" w:sz="1"/>
+              <w:left w:val="single" w:color="BBBBBB" w:sz="1"/>
+              <w:bottom w:val="single" w:color="BBBBBB" w:sz="1"/>
+              <w:right w:val="single" w:color="BBBBBB" w:sz="1"/>
+            </w:tcBorders>
+            <w:shd w:fill="EEF3F8" w:val="clear"/>
+            <w:tcMar>
+              <w:top w:type="dxa" w:w="60"/>
+              <w:left w:type="dxa" w:w="90"/>
+              <w:bottom w:type="dxa" w:w="60"/>
+              <w:right w:type="dxa" w:w="90"/>
+            </w:tcMar>
+            <w:vAlign w:val="center"/>
+          </w:tcPr>
+          <w:p>
+            <w:pPr>
+              <w:jc w:val="left"/>
+            </w:pPr>
+            <w:r>
+              <w:rPr>
+                <w:b/>
+                <w:bCs/>
+                <w:sz w:val="18"/>
+                <w:szCs w:val="18"/>
+              </w:rPr>
+              <w:t xml:space="preserve">5,6%</w:t>
+            </w:r>
+          </w:p>
+        </w:tc>
+        <w:tc>
+          <w:tcPr>
+            <w:tcW w:type="dxa" w:w="1790"/>
+            <w:tcBorders>
+              <w:top w:val="single" w:color="BBBBBB" w:sz="1"/>
+              <w:left w:val="single" w:color="BBBBBB" w:sz="1"/>
+              <w:bottom w:val="single" w:color="BBBBBB" w:sz="1"/>
+              <w:right w:val="single" w:color="BBBBBB" w:sz="1"/>
+            </w:tcBorders>
+            <w:shd w:fill="EEF3F8" w:val="clear"/>
+            <w:tcMar>
+              <w:top w:type="dxa" w:w="60"/>
+              <w:left w:type="dxa" w:w="90"/>
+              <w:bottom w:type="dxa" w:w="60"/>
+              <w:right w:type="dxa" w:w="90"/>
+            </w:tcMar>
+            <w:vAlign w:val="center"/>
+          </w:tcPr>
+          <w:p>
+            <w:pPr>
+              <w:jc w:val="left"/>
+            </w:pPr>
+            <w:r>
+              <w:rPr>
+                <w:b/>
+                <w:bCs/>
+                <w:sz w:val="18"/>
+                <w:szCs w:val="18"/>
+              </w:rPr>
+              <w:t xml:space="preserve">33</w:t>
+            </w:r>
+          </w:p>
+        </w:tc>
+        <w:tc>
+          <w:tcPr>
+            <w:tcW w:type="dxa" w:w="1790"/>
+            <w:tcBorders>
+              <w:top w:val="single" w:color="BBBBBB" w:sz="1"/>
+              <w:left w:val="single" w:color="BBBBBB" w:sz="1"/>
+              <w:bottom w:val="single" w:color="BBBBBB" w:sz="1"/>
+              <w:right w:val="single" w:color="BBBBBB" w:sz="1"/>
+            </w:tcBorders>
+            <w:shd w:fill="EEF3F8" w:val="clear"/>
+            <w:tcMar>
+              <w:top w:type="dxa" w:w="60"/>
+              <w:left w:type="dxa" w:w="90"/>
+              <w:bottom w:type="dxa" w:w="60"/>
+              <w:right w:type="dxa" w:w="90"/>
+            </w:tcMar>
+            <w:vAlign w:val="center"/>
+          </w:tcPr>
+          <w:p>
+            <w:pPr>
+              <w:jc w:val="left"/>
+            </w:pPr>
+            <w:r>
+              <w:rPr>
+                <w:b/>
+                <w:bCs/>
+                <w:sz w:val="18"/>
+                <w:szCs w:val="18"/>
+              </w:rPr>
+              <w:t xml:space="preserve">119</w:t>
+            </w:r>
+          </w:p>
+        </w:tc>
+      </w:tr>
+      <w:tr>
+        <w:tc>
+          <w:tcPr>
+            <w:tcW w:type="dxa" w:w="2200"/>
+            <w:tcBorders>
+              <w:top w:val="single" w:color="BBBBBB" w:sz="1"/>
+              <w:left w:val="single" w:color="BBBBBB" w:sz="1"/>
+              <w:bottom w:val="single" w:color="BBBBBB" w:sz="1"/>
+              <w:right w:val="single" w:color="BBBBBB" w:sz="1"/>
+            </w:tcBorders>
+            <w:tcMar>
+              <w:top w:type="dxa" w:w="60"/>
+              <w:left w:type="dxa" w:w="90"/>
+              <w:bottom w:type="dxa" w:w="60"/>
+              <w:right w:type="dxa" w:w="90"/>
+            </w:tcMar>
+            <w:vAlign w:val="center"/>
+          </w:tcPr>
+          <w:p>
+            <w:pPr>
+              <w:jc w:val="left"/>
+            </w:pPr>
+            <w:r>
+              <w:rPr>
+                <w:b/>
+                <w:bCs/>
+                <w:sz w:val="18"/>
+                <w:szCs w:val="18"/>
+              </w:rPr>
+              <w:t xml:space="preserve">cool</w:t>
+            </w:r>
+          </w:p>
+        </w:tc>
+        <w:tc>
+          <w:tcPr>
+            <w:tcW w:type="dxa" w:w="1790"/>
+            <w:tcBorders>
+              <w:top w:val="single" w:color="BBBBBB" w:sz="1"/>
+              <w:left w:val="single" w:color="BBBBBB" w:sz="1"/>
+              <w:bottom w:val="single" w:color="BBBBBB" w:sz="1"/>
+              <w:right w:val="single" w:color="BBBBBB" w:sz="1"/>
+            </w:tcBorders>
+            <w:tcMar>
+              <w:top w:type="dxa" w:w="60"/>
+              <w:left w:type="dxa" w:w="90"/>
+              <w:bottom w:type="dxa" w:w="60"/>
+              <w:right w:type="dxa" w:w="90"/>
+            </w:tcMar>
+            <w:vAlign w:val="center"/>
+          </w:tcPr>
+          <w:p>
+            <w:pPr>
+              <w:jc w:val="left"/>
+            </w:pPr>
+            <w:r>
+              <w:rPr>
+                <w:b/>
+                <w:bCs/>
+                <w:sz w:val="18"/>
+                <w:szCs w:val="18"/>
+              </w:rPr>
+              <w:t xml:space="preserve">3,3%</w:t>
+            </w:r>
+          </w:p>
+        </w:tc>
+        <w:tc>
+          <w:tcPr>
+            <w:tcW w:type="dxa" w:w="1790"/>
+            <w:tcBorders>
+              <w:top w:val="single" w:color="BBBBBB" w:sz="1"/>
+              <w:left w:val="single" w:color="BBBBBB" w:sz="1"/>
+              <w:bottom w:val="single" w:color="BBBBBB" w:sz="1"/>
+              <w:right w:val="single" w:color="BBBBBB" w:sz="1"/>
+            </w:tcBorders>
+            <w:tcMar>
+              <w:top w:type="dxa" w:w="60"/>
+              <w:left w:type="dxa" w:w="90"/>
+              <w:bottom w:type="dxa" w:w="60"/>
+              <w:right w:type="dxa" w:w="90"/>
+            </w:tcMar>
+            <w:vAlign w:val="center"/>
+          </w:tcPr>
+          <w:p>
+            <w:pPr>
+              <w:jc w:val="left"/>
+            </w:pPr>
+            <w:r>
+              <w:rPr>
+                <w:b/>
+                <w:bCs/>
+                <w:sz w:val="18"/>
+                <w:szCs w:val="18"/>
+              </w:rPr>
+              <w:t xml:space="preserve">4,0%</w:t>
+            </w:r>
+          </w:p>
+        </w:tc>
+        <w:tc>
+          <w:tcPr>
+            <w:tcW w:type="dxa" w:w="1790"/>
+            <w:tcBorders>
+              <w:top w:val="single" w:color="BBBBBB" w:sz="1"/>
+              <w:left w:val="single" w:color="BBBBBB" w:sz="1"/>
+              <w:bottom w:val="single" w:color="BBBBBB" w:sz="1"/>
+              <w:right w:val="single" w:color="BBBBBB" w:sz="1"/>
+            </w:tcBorders>
+            <w:tcMar>
+              <w:top w:type="dxa" w:w="60"/>
+              <w:left w:type="dxa" w:w="90"/>
+              <w:bottom w:type="dxa" w:w="60"/>
+              <w:right w:type="dxa" w:w="90"/>
+            </w:tcMar>
+            <w:vAlign w:val="center"/>
+          </w:tcPr>
+          <w:p>
+            <w:pPr>
+              <w:jc w:val="left"/>
+            </w:pPr>
+            <w:r>
+              <w:rPr>
+                <w:b/>
+                <w:bCs/>
+                <w:sz w:val="18"/>
+                <w:szCs w:val="18"/>
+              </w:rPr>
+              <w:t xml:space="preserve">8</w:t>
+            </w:r>
+          </w:p>
+        </w:tc>
+        <w:tc>
+          <w:tcPr>
+            <w:tcW w:type="dxa" w:w="1790"/>
+            <w:tcBorders>
+              <w:top w:val="single" w:color="BBBBBB" w:sz="1"/>
+              <w:left w:val="single" w:color="BBBBBB" w:sz="1"/>
+              <w:bottom w:val="single" w:color="BBBBBB" w:sz="1"/>
+              <w:right w:val="single" w:color="BBBBBB" w:sz="1"/>
+            </w:tcBorders>
+            <w:tcMar>
+              <w:top w:type="dxa" w:w="60"/>
+              <w:left w:type="dxa" w:w="90"/>
+              <w:bottom w:type="dxa" w:w="60"/>
+              <w:right w:type="dxa" w:w="90"/>
+            </w:tcMar>
+            <w:vAlign w:val="center"/>
+          </w:tcPr>
+          <w:p>
+            <w:pPr>
+              <w:jc w:val="left"/>
+            </w:pPr>
+            <w:r>
+              <w:rPr>
+                <w:b/>
+                <w:bCs/>
+                <w:sz w:val="18"/>
+                <w:szCs w:val="18"/>
+              </w:rPr>
+              <w:t xml:space="preserve">33</w:t>
+            </w:r>
+          </w:p>
+        </w:tc>
+      </w:tr>
+      <w:tr>
+        <w:tc>
+          <w:tcPr>
+            <w:tcW w:type="dxa" w:w="2200"/>
+            <w:tcBorders>
+              <w:top w:val="single" w:color="BBBBBB" w:sz="1"/>
+              <w:left w:val="single" w:color="BBBBBB" w:sz="1"/>
+              <w:bottom w:val="single" w:color="BBBBBB" w:sz="1"/>
+              <w:right w:val="single" w:color="BBBBBB" w:sz="1"/>
+            </w:tcBorders>
+            <w:shd w:fill="EEF3F8" w:val="clear"/>
+            <w:tcMar>
+              <w:top w:type="dxa" w:w="60"/>
+              <w:left w:type="dxa" w:w="90"/>
+              <w:bottom w:type="dxa" w:w="60"/>
+              <w:right w:type="dxa" w:w="90"/>
+            </w:tcMar>
+            <w:vAlign w:val="center"/>
+          </w:tcPr>
+          <w:p>
+            <w:pPr>
+              <w:jc w:val="left"/>
+            </w:pPr>
+            <w:r>
+              <w:rPr>
+                <w:b w:val="false"/>
+                <w:bCs w:val="false"/>
+                <w:sz w:val="18"/>
+                <w:szCs w:val="18"/>
+              </w:rPr>
+              <w:t xml:space="preserve">cold</w:t>
+            </w:r>
+          </w:p>
+        </w:tc>
+        <w:tc>
+          <w:tcPr>
+            <w:tcW w:type="dxa" w:w="1790"/>
+            <w:tcBorders>
+              <w:top w:val="single" w:color="BBBBBB" w:sz="1"/>
+              <w:left w:val="single" w:color="BBBBBB" w:sz="1"/>
+              <w:bottom w:val="single" w:color="BBBBBB" w:sz="1"/>
+              <w:right w:val="single" w:color="BBBBBB" w:sz="1"/>
+            </w:tcBorders>
+            <w:shd w:fill="EEF3F8" w:val="clear"/>
+            <w:tcMar>
+              <w:top w:type="dxa" w:w="60"/>
+              <w:left w:type="dxa" w:w="90"/>
+              <w:bottom w:type="dxa" w:w="60"/>
+              <w:right w:type="dxa" w:w="90"/>
+            </w:tcMar>
+            <w:vAlign w:val="center"/>
+          </w:tcPr>
+          <w:p>
+            <w:pPr>
+              <w:jc w:val="left"/>
+            </w:pPr>
+            <w:r>
+              <w:rPr>
+                <w:b/>
+                <w:bCs/>
+                <w:sz w:val="18"/>
+                <w:szCs w:val="18"/>
+              </w:rPr>
+              <w:t xml:space="preserve">0%</w:t>
+            </w:r>
+          </w:p>
+        </w:tc>
+        <w:tc>
+          <w:tcPr>
+            <w:tcW w:type="dxa" w:w="1790"/>
+            <w:tcBorders>
+              <w:top w:val="single" w:color="BBBBBB" w:sz="1"/>
+              <w:left w:val="single" w:color="BBBBBB" w:sz="1"/>
+              <w:bottom w:val="single" w:color="BBBBBB" w:sz="1"/>
+              <w:right w:val="single" w:color="BBBBBB" w:sz="1"/>
+            </w:tcBorders>
+            <w:shd w:fill="EEF3F8" w:val="clear"/>
+            <w:tcMar>
+              <w:top w:type="dxa" w:w="60"/>
+              <w:left w:type="dxa" w:w="90"/>
+              <w:bottom w:type="dxa" w:w="60"/>
+              <w:right w:type="dxa" w:w="90"/>
+            </w:tcMar>
+            <w:vAlign w:val="center"/>
+          </w:tcPr>
+          <w:p>
+            <w:pPr>
+              <w:jc w:val="left"/>
+            </w:pPr>
+            <w:r>
+              <w:rPr>
+                <w:b/>
+                <w:bCs/>
+                <w:sz w:val="18"/>
+                <w:szCs w:val="18"/>
+              </w:rPr>
+              <w:t xml:space="preserve">0%</w:t>
+            </w:r>
+          </w:p>
+        </w:tc>
+        <w:tc>
+          <w:tcPr>
+            <w:tcW w:type="dxa" w:w="1790"/>
+            <w:tcBorders>
+              <w:top w:val="single" w:color="BBBBBB" w:sz="1"/>
+              <w:left w:val="single" w:color="BBBBBB" w:sz="1"/>
+              <w:bottom w:val="single" w:color="BBBBBB" w:sz="1"/>
+              <w:right w:val="single" w:color="BBBBBB" w:sz="1"/>
+            </w:tcBorders>
+            <w:shd w:fill="EEF3F8" w:val="clear"/>
+            <w:tcMar>
+              <w:top w:type="dxa" w:w="60"/>
+              <w:left w:type="dxa" w:w="90"/>
+              <w:bottom w:type="dxa" w:w="60"/>
+              <w:right w:type="dxa" w:w="90"/>
+            </w:tcMar>
+            <w:vAlign w:val="center"/>
+          </w:tcPr>
+          <w:p>
+            <w:pPr>
+              <w:jc w:val="left"/>
+            </w:pPr>
+            <w:r>
+              <w:rPr>
+                <w:b/>
+                <w:bCs/>
+                <w:sz w:val="18"/>
+                <w:szCs w:val="18"/>
+              </w:rPr>
+              <w:t xml:space="preserve">0</w:t>
+            </w:r>
+          </w:p>
+        </w:tc>
+        <w:tc>
+          <w:tcPr>
+            <w:tcW w:type="dxa" w:w="1790"/>
+            <w:tcBorders>
+              <w:top w:val="single" w:color="BBBBBB" w:sz="1"/>
+              <w:left w:val="single" w:color="BBBBBB" w:sz="1"/>
+              <w:bottom w:val="single" w:color="BBBBBB" w:sz="1"/>
+              <w:right w:val="single" w:color="BBBBBB" w:sz="1"/>
+            </w:tcBorders>
+            <w:shd w:fill="EEF3F8" w:val="clear"/>
+            <w:tcMar>
+              <w:top w:type="dxa" w:w="60"/>
+              <w:left w:type="dxa" w:w="90"/>
+              <w:bottom w:type="dxa" w:w="60"/>
+              <w:right w:type="dxa" w:w="90"/>
+            </w:tcMar>
+            <w:vAlign w:val="center"/>
+          </w:tcPr>
+          <w:p>
+            <w:pPr>
+              <w:jc w:val="left"/>
+            </w:pPr>
+            <w:r>
+              <w:rPr>
+                <w:b/>
+                <w:bCs/>
+                <w:sz w:val="18"/>
+                <w:szCs w:val="18"/>
+              </w:rPr>
+              <w:t xml:space="preserve">0</w:t>
+            </w:r>
+          </w:p>
+        </w:tc>
+      </w:tr>
+    </w:tbl>
+    <w:p>
+      <w:pPr>
+        <w:spacing w:before="80"/>
+      </w:pPr>
+      <w:r>
+        <w:t xml:space="preserve">Não compensa: +1–2pp de alcance ao custo de ~4× mais candidatos; zero em cold. Mesmo a 3 saltos, a topologia alcança só ~5% dos coautores futuros — ~95% estão fora do grafo.</w:t>
+      </w:r>
+    </w:p>
+    <w:p>
+      <w:r>
+        <w:rPr>
+          <w:b/>
+          <w:bCs/>
+        </w:rPr>
+        <w:t xml:space="preserve">8.2 A riqueza heterogênea da KG ajuda a GNN? </w:t>
+      </w:r>
+      <w:r>
+        <w:t xml:space="preserve">Ablação (mesmas features/épocas/seed):</w:t>
+      </w:r>
+    </w:p>
+    <w:tbl>
+      <w:tblPr>
+        <w:tblW w:type="dxa" w:w="9360"/>
+        <w:tblBorders>
+          <w:top w:val="single" w:color="auto" w:sz="4"/>
+          <w:left w:val="single" w:color="auto" w:sz="4"/>
+          <w:bottom w:val="single" w:color="auto" w:sz="4"/>
+          <w:right w:val="single" w:color="auto" w:sz="4"/>
+          <w:insideH w:val="single" w:color="auto" w:sz="4"/>
+          <w:insideV w:val="single" w:color="auto" w:sz="4"/>
+        </w:tblBorders>
+      </w:tblPr>
+      <w:tblGrid>
+        <w:gridCol w:w="4680"/>
+        <w:gridCol w:w="2340"/>
+        <w:gridCol w:w="2340"/>
+      </w:tblGrid>
+      <w:tr>
+        <w:trPr>
+          <w:tblHeader/>
+        </w:trPr>
+        <w:tc>
+          <w:tcPr>
+            <w:tcW w:type="dxa" w:w="4680"/>
+            <w:tcBorders>
+              <w:top w:val="single" w:color="BBBBBB" w:sz="1"/>
+              <w:left w:val="single" w:color="BBBBBB" w:sz="1"/>
+              <w:bottom w:val="single" w:color="BBBBBB" w:sz="1"/>
+              <w:right w:val="single" w:color="BBBBBB" w:sz="1"/>
+            </w:tcBorders>
+            <w:shd w:fill="1F4E79" w:val="clear"/>
+            <w:tcMar>
+              <w:top w:type="dxa" w:w="60"/>
+              <w:left w:type="dxa" w:w="90"/>
+              <w:bottom w:type="dxa" w:w="60"/>
+              <w:right w:type="dxa" w:w="90"/>
+            </w:tcMar>
+            <w:vAlign w:val="center"/>
+          </w:tcPr>
+          <w:p>
+            <w:r>
+              <w:rPr>
+                <w:b/>
+                <w:bCs/>
+                <w:color w:val="FFFFFF"/>
+                <w:sz w:val="18"/>
+                <w:szCs w:val="18"/>
+              </w:rPr>
+              <w:t xml:space="preserve">GNN</w:t>
+            </w:r>
+          </w:p>
+        </w:tc>
+        <w:tc>
+          <w:tcPr>
+            <w:tcW w:type="dxa" w:w="2340"/>
+            <w:tcBorders>
+              <w:top w:val="single" w:color="BBBBBB" w:sz="1"/>
+              <w:left w:val="single" w:color="BBBBBB" w:sz="1"/>
+              <w:bottom w:val="single" w:color="BBBBBB" w:sz="1"/>
+              <w:right w:val="single" w:color="BBBBBB" w:sz="1"/>
+            </w:tcBorders>
+            <w:shd w:fill="1F4E79" w:val="clear"/>
+            <w:tcMar>
+              <w:top w:type="dxa" w:w="60"/>
+              <w:left w:type="dxa" w:w="90"/>
+              <w:bottom w:type="dxa" w:w="60"/>
+              <w:right w:type="dxa" w:w="90"/>
+            </w:tcMar>
+            <w:vAlign w:val="center"/>
+          </w:tcPr>
+          <w:p>
+            <w:r>
+              <w:rPr>
+                <w:b/>
+                <w:bCs/>
+                <w:color w:val="FFFFFF"/>
+                <w:sz w:val="18"/>
+                <w:szCs w:val="18"/>
+              </w:rPr>
+              <w:t xml:space="preserve">warm R@200</w:t>
+            </w:r>
+          </w:p>
+        </w:tc>
+        <w:tc>
+          <w:tcPr>
+            <w:tcW w:type="dxa" w:w="2340"/>
+            <w:tcBorders>
+              <w:top w:val="single" w:color="BBBBBB" w:sz="1"/>
+              <w:left w:val="single" w:color="BBBBBB" w:sz="1"/>
+              <w:bottom w:val="single" w:color="BBBBBB" w:sz="1"/>
+              <w:right w:val="single" w:color="BBBBBB" w:sz="1"/>
+            </w:tcBorders>
+            <w:shd w:fill="1F4E79" w:val="clear"/>
+            <w:tcMar>
+              <w:top w:type="dxa" w:w="60"/>
+              <w:left w:type="dxa" w:w="90"/>
+              <w:bottom w:type="dxa" w:w="60"/>
+              <w:right w:type="dxa" w:w="90"/>
+            </w:tcMar>
+            <w:vAlign w:val="center"/>
+          </w:tcPr>
+          <w:p>
+            <w:r>
+              <w:rPr>
+                <w:b/>
+                <w:bCs/>
+                <w:color w:val="FFFFFF"/>
+                <w:sz w:val="18"/>
+                <w:szCs w:val="18"/>
+              </w:rPr>
+              <w:t xml:space="preserve">cool R@200</w:t>
+            </w:r>
+          </w:p>
+        </w:tc>
+      </w:tr>
+      <w:tr>
+        <w:tc>
+          <w:tcPr>
+            <w:tcW w:type="dxa" w:w="4680"/>
+            <w:tcBorders>
+              <w:top w:val="single" w:color="BBBBBB" w:sz="1"/>
+              <w:left w:val="single" w:color="BBBBBB" w:sz="1"/>
+              <w:bottom w:val="single" w:color="BBBBBB" w:sz="1"/>
+              <w:right w:val="single" w:color="BBBBBB" w:sz="1"/>
+            </w:tcBorders>
+            <w:tcMar>
+              <w:top w:type="dxa" w:w="60"/>
+              <w:left w:type="dxa" w:w="90"/>
+              <w:bottom w:type="dxa" w:w="60"/>
+              <w:right w:type="dxa" w:w="90"/>
+            </w:tcMar>
+            <w:vAlign w:val="center"/>
+          </w:tcPr>
+          <w:p>
+            <w:pPr>
+              <w:jc w:val="left"/>
+            </w:pPr>
+            <w:r>
+              <w:rPr>
+                <w:b/>
+                <w:bCs/>
+                <w:sz w:val="18"/>
+                <w:szCs w:val="18"/>
+              </w:rPr>
+              <w:t xml:space="preserve">KG completo (6 relações)</w:t>
+            </w:r>
+          </w:p>
+        </w:tc>
+        <w:tc>
+          <w:tcPr>
+            <w:tcW w:type="dxa" w:w="2340"/>
+            <w:tcBorders>
+              <w:top w:val="single" w:color="BBBBBB" w:sz="1"/>
+              <w:left w:val="single" w:color="BBBBBB" w:sz="1"/>
+              <w:bottom w:val="single" w:color="BBBBBB" w:sz="1"/>
+              <w:right w:val="single" w:color="BBBBBB" w:sz="1"/>
+            </w:tcBorders>
+            <w:tcMar>
+              <w:top w:type="dxa" w:w="60"/>
+              <w:left w:type="dxa" w:w="90"/>
+              <w:bottom w:type="dxa" w:w="60"/>
+              <w:right w:type="dxa" w:w="90"/>
+            </w:tcMar>
+            <w:vAlign w:val="center"/>
+          </w:tcPr>
+          <w:p>
+            <w:pPr>
+              <w:jc w:val="left"/>
+            </w:pPr>
+            <w:r>
+              <w:rPr>
+                <w:b/>
+                <w:bCs/>
+                <w:sz w:val="18"/>
+                <w:szCs w:val="18"/>
+              </w:rPr>
+              <w:t xml:space="preserve">4,01%</w:t>
+            </w:r>
+          </w:p>
+        </w:tc>
+        <w:tc>
+          <w:tcPr>
+            <w:tcW w:type="dxa" w:w="2340"/>
+            <w:tcBorders>
+              <w:top w:val="single" w:color="BBBBBB" w:sz="1"/>
+              <w:left w:val="single" w:color="BBBBBB" w:sz="1"/>
+              <w:bottom w:val="single" w:color="BBBBBB" w:sz="1"/>
+              <w:right w:val="single" w:color="BBBBBB" w:sz="1"/>
+            </w:tcBorders>
+            <w:tcMar>
+              <w:top w:type="dxa" w:w="60"/>
+              <w:left w:type="dxa" w:w="90"/>
+              <w:bottom w:type="dxa" w:w="60"/>
+              <w:right w:type="dxa" w:w="90"/>
+            </w:tcMar>
+            <w:vAlign w:val="center"/>
+          </w:tcPr>
+          <w:p>
+            <w:pPr>
+              <w:jc w:val="left"/>
+            </w:pPr>
+            <w:r>
+              <w:rPr>
+                <w:b/>
+                <w:bCs/>
+                <w:sz w:val="18"/>
+                <w:szCs w:val="18"/>
+              </w:rPr>
+              <w:t xml:space="preserve">3,35%</w:t>
+            </w:r>
+          </w:p>
+        </w:tc>
+      </w:tr>
+      <w:tr>
+        <w:tc>
+          <w:tcPr>
+            <w:tcW w:type="dxa" w:w="4680"/>
+            <w:tcBorders>
+              <w:top w:val="single" w:color="BBBBBB" w:sz="1"/>
+              <w:left w:val="single" w:color="BBBBBB" w:sz="1"/>
+              <w:bottom w:val="single" w:color="BBBBBB" w:sz="1"/>
+              <w:right w:val="single" w:color="BBBBBB" w:sz="1"/>
+            </w:tcBorders>
+            <w:shd w:fill="EEF3F8" w:val="clear"/>
+            <w:tcMar>
+              <w:top w:type="dxa" w:w="60"/>
+              <w:left w:type="dxa" w:w="90"/>
+              <w:bottom w:type="dxa" w:w="60"/>
+              <w:right w:type="dxa" w:w="90"/>
+            </w:tcMar>
+            <w:vAlign w:val="center"/>
+          </w:tcPr>
+          <w:p>
+            <w:pPr>
+              <w:jc w:val="left"/>
+            </w:pPr>
+            <w:r>
+              <w:rPr>
+                <w:b/>
+                <w:bCs/>
+                <w:sz w:val="18"/>
+                <w:szCs w:val="18"/>
+              </w:rPr>
+              <w:t xml:space="preserve">só co-autoria</w:t>
+            </w:r>
+          </w:p>
+        </w:tc>
+        <w:tc>
+          <w:tcPr>
+            <w:tcW w:type="dxa" w:w="2340"/>
+            <w:tcBorders>
+              <w:top w:val="single" w:color="BBBBBB" w:sz="1"/>
+              <w:left w:val="single" w:color="BBBBBB" w:sz="1"/>
+              <w:bottom w:val="single" w:color="BBBBBB" w:sz="1"/>
+              <w:right w:val="single" w:color="BBBBBB" w:sz="1"/>
+            </w:tcBorders>
+            <w:shd w:fill="EEF3F8" w:val="clear"/>
+            <w:tcMar>
+              <w:top w:type="dxa" w:w="60"/>
+              <w:left w:type="dxa" w:w="90"/>
+              <w:bottom w:type="dxa" w:w="60"/>
+              <w:right w:type="dxa" w:w="90"/>
+            </w:tcMar>
+            <w:vAlign w:val="center"/>
+          </w:tcPr>
+          <w:p>
+            <w:pPr>
+              <w:jc w:val="left"/>
+            </w:pPr>
+            <w:r>
+              <w:rPr>
+                <w:b/>
+                <w:bCs/>
+                <w:sz w:val="18"/>
+                <w:szCs w:val="18"/>
+              </w:rPr>
+              <w:t xml:space="preserve">4,00%</w:t>
+            </w:r>
+          </w:p>
+        </w:tc>
+        <w:tc>
+          <w:tcPr>
+            <w:tcW w:type="dxa" w:w="2340"/>
+            <w:tcBorders>
+              <w:top w:val="single" w:color="BBBBBB" w:sz="1"/>
+              <w:left w:val="single" w:color="BBBBBB" w:sz="1"/>
+              <w:bottom w:val="single" w:color="BBBBBB" w:sz="1"/>
+              <w:right w:val="single" w:color="BBBBBB" w:sz="1"/>
+            </w:tcBorders>
+            <w:shd w:fill="EEF3F8" w:val="clear"/>
+            <w:tcMar>
+              <w:top w:type="dxa" w:w="60"/>
+              <w:left w:type="dxa" w:w="90"/>
+              <w:bottom w:type="dxa" w:w="60"/>
+              <w:right w:type="dxa" w:w="90"/>
+            </w:tcMar>
+            <w:vAlign w:val="center"/>
+          </w:tcPr>
+          <w:p>
+            <w:pPr>
+              <w:jc w:val="left"/>
+            </w:pPr>
+            <w:r>
+              <w:rPr>
+                <w:b/>
+                <w:bCs/>
+                <w:sz w:val="18"/>
+                <w:szCs w:val="18"/>
+              </w:rPr>
+              <w:t xml:space="preserve">3,35%</w:t>
+            </w:r>
+          </w:p>
+        </w:tc>
+      </w:tr>
+    </w:tbl>
+    <w:p>
+      <w:pPr>
+        <w:spacing w:before="80"/>
+      </w:pPr>
+      <w:r>
+        <w:t xml:space="preserve">Idênticos: as relações extras (venue, conceito, instituição, citação) e o enriquecimento GenAI não agregam à recomendação. O sinal de grafo útil é a co-autoria.</w:t>
+      </w:r>
+    </w:p>
+    <w:p>
+      <w:pPr>
+        <w:pStyle w:val="Heading1"/>
+      </w:pPr>
+      <w:r>
+        <w:t xml:space="preserve">9. Validação da tese</w:t>
+      </w:r>
+    </w:p>
+    <w:tbl>
+      <w:tblPr>
+        <w:tblW w:type="dxa" w:w="9360"/>
+        <w:tblBorders>
+          <w:top w:val="single" w:color="auto" w:sz="4"/>
+          <w:left w:val="single" w:color="auto" w:sz="4"/>
+          <w:bottom w:val="single" w:color="auto" w:sz="4"/>
+          <w:right w:val="single" w:color="auto" w:sz="4"/>
+          <w:insideH w:val="single" w:color="auto" w:sz="4"/>
+          <w:insideV w:val="single" w:color="auto" w:sz="4"/>
+        </w:tblBorders>
+      </w:tblPr>
+      <w:tblGrid>
+        <w:gridCol w:w="4200"/>
+        <w:gridCol w:w="2080"/>
+        <w:gridCol w:w="3080"/>
+      </w:tblGrid>
+      <w:tr>
+        <w:trPr>
+          <w:tblHeader/>
+        </w:trPr>
+        <w:tc>
+          <w:tcPr>
+            <w:tcW w:type="dxa" w:w="4200"/>
+            <w:tcBorders>
+              <w:top w:val="single" w:color="BBBBBB" w:sz="1"/>
+              <w:left w:val="single" w:color="BBBBBB" w:sz="1"/>
+              <w:bottom w:val="single" w:color="BBBBBB" w:sz="1"/>
+              <w:right w:val="single" w:color="BBBBBB" w:sz="1"/>
+            </w:tcBorders>
+            <w:shd w:fill="1F4E79" w:val="clear"/>
+            <w:tcMar>
+              <w:top w:type="dxa" w:w="60"/>
+              <w:left w:type="dxa" w:w="90"/>
+              <w:bottom w:type="dxa" w:w="60"/>
+              <w:right w:type="dxa" w:w="90"/>
+            </w:tcMar>
+            <w:vAlign w:val="center"/>
+          </w:tcPr>
+          <w:p>
+            <w:r>
+              <w:rPr>
+                <w:b/>
+                <w:bCs/>
+                <w:color w:val="FFFFFF"/>
+                <w:sz w:val="18"/>
+                <w:szCs w:val="18"/>
+              </w:rPr>
+              <w:t xml:space="preserve">Hipótese</w:t>
+            </w:r>
+          </w:p>
+        </w:tc>
+        <w:tc>
+          <w:tcPr>
+            <w:tcW w:type="dxa" w:w="2080"/>
+            <w:tcBorders>
+              <w:top w:val="single" w:color="BBBBBB" w:sz="1"/>
+              <w:left w:val="single" w:color="BBBBBB" w:sz="1"/>
+              <w:bottom w:val="single" w:color="BBBBBB" w:sz="1"/>
+              <w:right w:val="single" w:color="BBBBBB" w:sz="1"/>
+            </w:tcBorders>
+            <w:shd w:fill="1F4E79" w:val="clear"/>
+            <w:tcMar>
+              <w:top w:type="dxa" w:w="60"/>
+              <w:left w:type="dxa" w:w="90"/>
+              <w:bottom w:type="dxa" w:w="60"/>
+              <w:right w:type="dxa" w:w="90"/>
+            </w:tcMar>
+            <w:vAlign w:val="center"/>
+          </w:tcPr>
+          <w:p>
+            <w:r>
+              <w:rPr>
+                <w:b/>
+                <w:bCs/>
+                <w:color w:val="FFFFFF"/>
+                <w:sz w:val="18"/>
+                <w:szCs w:val="18"/>
+              </w:rPr>
+              <w:t xml:space="preserve">Veredito</w:t>
+            </w:r>
+          </w:p>
+        </w:tc>
+        <w:tc>
+          <w:tcPr>
+            <w:tcW w:type="dxa" w:w="3080"/>
+            <w:tcBorders>
+              <w:top w:val="single" w:color="BBBBBB" w:sz="1"/>
+              <w:left w:val="single" w:color="BBBBBB" w:sz="1"/>
+              <w:bottom w:val="single" w:color="BBBBBB" w:sz="1"/>
+              <w:right w:val="single" w:color="BBBBBB" w:sz="1"/>
+            </w:tcBorders>
+            <w:shd w:fill="1F4E79" w:val="clear"/>
+            <w:tcMar>
+              <w:top w:type="dxa" w:w="60"/>
+              <w:left w:type="dxa" w:w="90"/>
+              <w:bottom w:type="dxa" w:w="60"/>
+              <w:right w:type="dxa" w:w="90"/>
+            </w:tcMar>
+            <w:vAlign w:val="center"/>
+          </w:tcPr>
+          <w:p>
+            <w:r>
+              <w:rPr>
+                <w:b/>
+                <w:bCs/>
+                <w:color w:val="FFFFFF"/>
+                <w:sz w:val="18"/>
+                <w:szCs w:val="18"/>
+              </w:rPr>
+              <w:t xml:space="preserve">Evidência</w:t>
+            </w:r>
+          </w:p>
+        </w:tc>
+      </w:tr>
+      <w:tr>
+        <w:tc>
+          <w:tcPr>
+            <w:tcW w:type="dxa" w:w="4200"/>
+            <w:tcBorders>
+              <w:top w:val="single" w:color="BBBBBB" w:sz="1"/>
+              <w:left w:val="single" w:color="BBBBBB" w:sz="1"/>
+              <w:bottom w:val="single" w:color="BBBBBB" w:sz="1"/>
+              <w:right w:val="single" w:color="BBBBBB" w:sz="1"/>
+            </w:tcBorders>
+            <w:tcMar>
+              <w:top w:type="dxa" w:w="60"/>
+              <w:left w:type="dxa" w:w="90"/>
+              <w:bottom w:type="dxa" w:w="60"/>
+              <w:right w:type="dxa" w:w="90"/>
+            </w:tcMar>
+            <w:vAlign w:val="center"/>
+          </w:tcPr>
+          <w:p>
+            <w:pPr>
+              <w:jc w:val="left"/>
+            </w:pPr>
+            <w:r>
+              <w:rPr>
+                <w:b w:val="false"/>
+                <w:bCs w:val="false"/>
+                <w:sz w:val="18"/>
+                <w:szCs w:val="18"/>
+              </w:rPr>
+              <w:t xml:space="preserve">Fusão CNN+GNN &gt; cada isolada (literal)</w:t>
+            </w:r>
+          </w:p>
+        </w:tc>
+        <w:tc>
+          <w:tcPr>
+            <w:tcW w:type="dxa" w:w="2080"/>
+            <w:tcBorders>
+              <w:top w:val="single" w:color="BBBBBB" w:sz="1"/>
+              <w:left w:val="single" w:color="BBBBBB" w:sz="1"/>
+              <w:bottom w:val="single" w:color="BBBBBB" w:sz="1"/>
+              <w:right w:val="single" w:color="BBBBBB" w:sz="1"/>
+            </w:tcBorders>
+            <w:shd w:fill="F8D7DA" w:val="clear"/>
+            <w:tcMar>
+              <w:top w:type="dxa" w:w="60"/>
+              <w:left w:type="dxa" w:w="90"/>
+              <w:bottom w:type="dxa" w:w="60"/>
+              <w:right w:type="dxa" w:w="90"/>
+            </w:tcMar>
+            <w:vAlign w:val="center"/>
+          </w:tcPr>
+          <w:p>
+            <w:pPr>
+              <w:jc w:val="left"/>
+            </w:pPr>
+            <w:r>
+              <w:rPr>
+                <w:b/>
+                <w:bCs/>
+                <w:sz w:val="18"/>
+                <w:szCs w:val="18"/>
+              </w:rPr>
+              <w:t xml:space="preserve">Não confirmada</w:t>
+            </w:r>
+          </w:p>
+        </w:tc>
+        <w:tc>
+          <w:tcPr>
+            <w:tcW w:type="dxa" w:w="3080"/>
+            <w:tcBorders>
+              <w:top w:val="single" w:color="BBBBBB" w:sz="1"/>
+              <w:left w:val="single" w:color="BBBBBB" w:sz="1"/>
+              <w:bottom w:val="single" w:color="BBBBBB" w:sz="1"/>
+              <w:right w:val="single" w:color="BBBBBB" w:sz="1"/>
+            </w:tcBorders>
+            <w:tcMar>
+              <w:top w:type="dxa" w:w="60"/>
+              <w:left w:type="dxa" w:w="90"/>
+              <w:bottom w:type="dxa" w:w="60"/>
+              <w:right w:type="dxa" w:w="90"/>
+            </w:tcMar>
+            <w:vAlign w:val="center"/>
+          </w:tcPr>
+          <w:p>
+            <w:pPr>
+              <w:jc w:val="left"/>
+            </w:pPr>
+            <w:r>
+              <w:rPr>
+                <w:b/>
+                <w:bCs/>
+                <w:sz w:val="18"/>
+                <w:szCs w:val="18"/>
+              </w:rPr>
+              <w:t xml:space="preserve">Fusão empata GNN/RF (warm 3,99/cool 3,35)</w:t>
+            </w:r>
+          </w:p>
+        </w:tc>
+      </w:tr>
+      <w:tr>
+        <w:tc>
+          <w:tcPr>
+            <w:tcW w:type="dxa" w:w="4200"/>
+            <w:tcBorders>
+              <w:top w:val="single" w:color="BBBBBB" w:sz="1"/>
+              <w:left w:val="single" w:color="BBBBBB" w:sz="1"/>
+              <w:bottom w:val="single" w:color="BBBBBB" w:sz="1"/>
+              <w:right w:val="single" w:color="BBBBBB" w:sz="1"/>
+            </w:tcBorders>
+            <w:shd w:fill="EEF3F8" w:val="clear"/>
+            <w:tcMar>
+              <w:top w:type="dxa" w:w="60"/>
+              <w:left w:type="dxa" w:w="90"/>
+              <w:bottom w:type="dxa" w:w="60"/>
+              <w:right w:type="dxa" w:w="90"/>
+            </w:tcMar>
+            <w:vAlign w:val="center"/>
+          </w:tcPr>
+          <w:p>
+            <w:pPr>
+              <w:jc w:val="left"/>
+            </w:pPr>
+            <w:r>
+              <w:rPr>
+                <w:b w:val="false"/>
+                <w:bCs w:val="false"/>
+                <w:sz w:val="18"/>
+                <w:szCs w:val="18"/>
+              </w:rPr>
+              <w:t xml:space="preserve">Texto amplia candidatos &gt; topologia (refinada)</w:t>
+            </w:r>
+          </w:p>
+        </w:tc>
+        <w:tc>
+          <w:tcPr>
+            <w:tcW w:type="dxa" w:w="2080"/>
+            <w:tcBorders>
+              <w:top w:val="single" w:color="BBBBBB" w:sz="1"/>
+              <w:left w:val="single" w:color="BBBBBB" w:sz="1"/>
+              <w:bottom w:val="single" w:color="BBBBBB" w:sz="1"/>
+              <w:right w:val="single" w:color="BBBBBB" w:sz="1"/>
+            </w:tcBorders>
+            <w:shd w:fill="DDEBD8" w:val="clear"/>
+            <w:tcMar>
+              <w:top w:type="dxa" w:w="60"/>
+              <w:left w:type="dxa" w:w="90"/>
+              <w:bottom w:type="dxa" w:w="60"/>
+              <w:right w:type="dxa" w:w="90"/>
+            </w:tcMar>
+            <w:vAlign w:val="center"/>
+          </w:tcPr>
+          <w:p>
+            <w:pPr>
+              <w:jc w:val="left"/>
+            </w:pPr>
+            <w:r>
+              <w:rPr>
+                <w:b/>
+                <w:bCs/>
+                <w:sz w:val="18"/>
+                <w:szCs w:val="18"/>
+              </w:rPr>
+              <w:t xml:space="preserve">Confirmada</w:t>
+            </w:r>
+          </w:p>
+        </w:tc>
+        <w:tc>
+          <w:tcPr>
+            <w:tcW w:type="dxa" w:w="3080"/>
+            <w:tcBorders>
+              <w:top w:val="single" w:color="BBBBBB" w:sz="1"/>
+              <w:left w:val="single" w:color="BBBBBB" w:sz="1"/>
+              <w:bottom w:val="single" w:color="BBBBBB" w:sz="1"/>
+              <w:right w:val="single" w:color="BBBBBB" w:sz="1"/>
+            </w:tcBorders>
+            <w:shd w:fill="EEF3F8" w:val="clear"/>
+            <w:tcMar>
+              <w:top w:type="dxa" w:w="60"/>
+              <w:left w:type="dxa" w:w="90"/>
+              <w:bottom w:type="dxa" w:w="60"/>
+              <w:right w:type="dxa" w:w="90"/>
+            </w:tcMar>
+            <w:vAlign w:val="center"/>
+          </w:tcPr>
+          <w:p>
+            <w:pPr>
+              <w:jc w:val="left"/>
+            </w:pPr>
+            <w:r>
+              <w:rPr>
+                <w:b/>
+                <w:bCs/>
+                <w:sz w:val="18"/>
+                <w:szCs w:val="18"/>
+              </w:rPr>
+              <w:t xml:space="preserve">cool +4,0pp p=1e-23; supera oráculo topológico</w:t>
+            </w:r>
+          </w:p>
+        </w:tc>
+      </w:tr>
+      <w:tr>
+        <w:tc>
+          <w:tcPr>
+            <w:tcW w:type="dxa" w:w="4200"/>
+            <w:tcBorders>
+              <w:top w:val="single" w:color="BBBBBB" w:sz="1"/>
+              <w:left w:val="single" w:color="BBBBBB" w:sz="1"/>
+              <w:bottom w:val="single" w:color="BBBBBB" w:sz="1"/>
+              <w:right w:val="single" w:color="BBBBBB" w:sz="1"/>
+            </w:tcBorders>
+            <w:tcMar>
+              <w:top w:type="dxa" w:w="60"/>
+              <w:left w:type="dxa" w:w="90"/>
+              <w:bottom w:type="dxa" w:w="60"/>
+              <w:right w:type="dxa" w:w="90"/>
+            </w:tcMar>
+            <w:vAlign w:val="center"/>
+          </w:tcPr>
+          <w:p>
+            <w:pPr>
+              <w:jc w:val="left"/>
+            </w:pPr>
+            <w:r>
+              <w:rPr>
+                <w:b w:val="false"/>
+                <w:bCs w:val="false"/>
+                <w:sz w:val="18"/>
+                <w:szCs w:val="18"/>
+              </w:rPr>
+              <w:t xml:space="preserve">Texto essencial no cold-start</w:t>
+            </w:r>
+          </w:p>
+        </w:tc>
+        <w:tc>
+          <w:tcPr>
+            <w:tcW w:type="dxa" w:w="2080"/>
+            <w:tcBorders>
+              <w:top w:val="single" w:color="BBBBBB" w:sz="1"/>
+              <w:left w:val="single" w:color="BBBBBB" w:sz="1"/>
+              <w:bottom w:val="single" w:color="BBBBBB" w:sz="1"/>
+              <w:right w:val="single" w:color="BBBBBB" w:sz="1"/>
+            </w:tcBorders>
+            <w:shd w:fill="DDEBD8" w:val="clear"/>
+            <w:tcMar>
+              <w:top w:type="dxa" w:w="60"/>
+              <w:left w:type="dxa" w:w="90"/>
+              <w:bottom w:type="dxa" w:w="60"/>
+              <w:right w:type="dxa" w:w="90"/>
+            </w:tcMar>
+            <w:vAlign w:val="center"/>
+          </w:tcPr>
+          <w:p>
+            <w:pPr>
+              <w:jc w:val="left"/>
+            </w:pPr>
+            <w:r>
+              <w:rPr>
+                <w:b/>
+                <w:bCs/>
+                <w:sz w:val="18"/>
+                <w:szCs w:val="18"/>
+              </w:rPr>
+              <w:t xml:space="preserve">Confirmada</w:t>
+            </w:r>
+          </w:p>
+        </w:tc>
+        <w:tc>
+          <w:tcPr>
+            <w:tcW w:type="dxa" w:w="3080"/>
+            <w:tcBorders>
+              <w:top w:val="single" w:color="BBBBBB" w:sz="1"/>
+              <w:left w:val="single" w:color="BBBBBB" w:sz="1"/>
+              <w:bottom w:val="single" w:color="BBBBBB" w:sz="1"/>
+              <w:right w:val="single" w:color="BBBBBB" w:sz="1"/>
+            </w:tcBorders>
+            <w:tcMar>
+              <w:top w:type="dxa" w:w="60"/>
+              <w:left w:type="dxa" w:w="90"/>
+              <w:bottom w:type="dxa" w:w="60"/>
+              <w:right w:type="dxa" w:w="90"/>
+            </w:tcMar>
+            <w:vAlign w:val="center"/>
+          </w:tcPr>
+          <w:p>
+            <w:pPr>
+              <w:jc w:val="left"/>
+            </w:pPr>
+            <w:r>
+              <w:rPr>
+                <w:b/>
+                <w:bCs/>
+                <w:sz w:val="18"/>
+                <w:szCs w:val="18"/>
+              </w:rPr>
+              <w:t xml:space="preserve">topologia 0%; texto 6,2% (p&lt;0,001)</w:t>
+            </w:r>
+          </w:p>
+        </w:tc>
+      </w:tr>
+      <w:tr>
+        <w:tc>
+          <w:tcPr>
+            <w:tcW w:type="dxa" w:w="4200"/>
+            <w:tcBorders>
+              <w:top w:val="single" w:color="BBBBBB" w:sz="1"/>
+              <w:left w:val="single" w:color="BBBBBB" w:sz="1"/>
+              <w:bottom w:val="single" w:color="BBBBBB" w:sz="1"/>
+              <w:right w:val="single" w:color="BBBBBB" w:sz="1"/>
+            </w:tcBorders>
+            <w:shd w:fill="EEF3F8" w:val="clear"/>
+            <w:tcMar>
+              <w:top w:type="dxa" w:w="60"/>
+              <w:left w:type="dxa" w:w="90"/>
+              <w:bottom w:type="dxa" w:w="60"/>
+              <w:right w:type="dxa" w:w="90"/>
+            </w:tcMar>
+            <w:vAlign w:val="center"/>
+          </w:tcPr>
+          <w:p>
+            <w:pPr>
+              <w:jc w:val="left"/>
+            </w:pPr>
+            <w:r>
+              <w:rPr>
+                <w:b w:val="false"/>
+                <w:bCs w:val="false"/>
+                <w:sz w:val="18"/>
+                <w:szCs w:val="18"/>
+              </w:rPr>
+              <w:t xml:space="preserve">Enriquecimento GenAI melhora a GNN</w:t>
+            </w:r>
+          </w:p>
+        </w:tc>
+        <w:tc>
+          <w:tcPr>
+            <w:tcW w:type="dxa" w:w="2080"/>
+            <w:tcBorders>
+              <w:top w:val="single" w:color="BBBBBB" w:sz="1"/>
+              <w:left w:val="single" w:color="BBBBBB" w:sz="1"/>
+              <w:bottom w:val="single" w:color="BBBBBB" w:sz="1"/>
+              <w:right w:val="single" w:color="BBBBBB" w:sz="1"/>
+            </w:tcBorders>
+            <w:shd w:fill="F8D7DA" w:val="clear"/>
+            <w:tcMar>
+              <w:top w:type="dxa" w:w="60"/>
+              <w:left w:type="dxa" w:w="90"/>
+              <w:bottom w:type="dxa" w:w="60"/>
+              <w:right w:type="dxa" w:w="90"/>
+            </w:tcMar>
+            <w:vAlign w:val="center"/>
+          </w:tcPr>
+          <w:p>
+            <w:pPr>
+              <w:jc w:val="left"/>
+            </w:pPr>
+            <w:r>
+              <w:rPr>
+                <w:b/>
+                <w:bCs/>
+                <w:sz w:val="18"/>
+                <w:szCs w:val="18"/>
+              </w:rPr>
+              <w:t xml:space="preserve">Não confirmada</w:t>
+            </w:r>
+          </w:p>
+        </w:tc>
+        <w:tc>
+          <w:tcPr>
+            <w:tcW w:type="dxa" w:w="3080"/>
+            <w:tcBorders>
+              <w:top w:val="single" w:color="BBBBBB" w:sz="1"/>
+              <w:left w:val="single" w:color="BBBBBB" w:sz="1"/>
+              <w:bottom w:val="single" w:color="BBBBBB" w:sz="1"/>
+              <w:right w:val="single" w:color="BBBBBB" w:sz="1"/>
+            </w:tcBorders>
+            <w:shd w:fill="EEF3F8" w:val="clear"/>
+            <w:tcMar>
+              <w:top w:type="dxa" w:w="60"/>
+              <w:left w:type="dxa" w:w="90"/>
+              <w:bottom w:type="dxa" w:w="60"/>
+              <w:right w:type="dxa" w:w="90"/>
+            </w:tcMar>
+            <w:vAlign w:val="center"/>
+          </w:tcPr>
+          <w:p>
+            <w:pPr>
+              <w:jc w:val="left"/>
+            </w:pPr>
+            <w:r>
+              <w:rPr>
+                <w:b/>
+                <w:bCs/>
+                <w:sz w:val="18"/>
+                <w:szCs w:val="18"/>
+              </w:rPr>
+              <w:t xml:space="preserve">ablação: KG completo ≈ só co-autoria</w:t>
+            </w:r>
+          </w:p>
+        </w:tc>
+      </w:tr>
+    </w:tbl>
+    <w:p>
+      <w:r>
+        <w:rPr>
+          <w:b/>
+          <w:bCs/>
+        </w:rPr>
+        <w:t xml:space="preserve">Veredito geral: </w:t>
+      </w:r>
+      <w:r>
+        <w:t xml:space="preserve">a tese é validada em forma refinada — a contribuição multimodal não está em fundir representações, e sim em usar a semântica textual para ampliar o espaço de candidatos, decisiva em redes esparsas e no cold-start, onde a topologia falha. É um resultado positivo, defensável e original.</w:t>
+      </w:r>
+    </w:p>
+    <w:p>
+      <w:pPr>
+        <w:pStyle w:val="Heading1"/>
+      </w:pPr>
+      <w:r>
+        <w:t xml:space="preserve">10. Discussão — lacunas, dados semânticos e combinações</w:t>
+      </w:r>
+    </w:p>
+    <w:p>
+      <w:r>
+        <w:rPr>
+          <w:b/>
+          <w:bCs/>
+        </w:rPr>
+        <w:t xml:space="preserve">Lacunas (a explorar): </w:t>
+      </w:r>
+      <w:r>
+        <w:t xml:space="preserve">encoder congelado (sem fine-tuning); learning-to-rank sobre o pool híbrido; GNN com atenção (HAN); ablação do sinal textual (título × abstract × conceitos); generalização a mais domínios.</w:t>
+      </w:r>
+    </w:p>
+    <w:p>
+      <w:r>
+        <w:rPr>
+          <w:b/>
+          <w:bCs/>
+        </w:rPr>
+        <w:t xml:space="preserve">Mais dados semânticos: </w:t>
       </w:r>
     </w:p>
     <w:p>
@@ -2939,14 +4850,7 @@
         </w:numPr>
       </w:pPr>
       <w:r>
-        <w:rPr>
-          <w:b/>
-          <w:bCs/>
-        </w:rPr>
-        <w:t xml:space="preserve">RF &gt; Baseline em recall: </w:t>
-      </w:r>
-      <w:r>
-        <w:t xml:space="preserve">o re-ranqueamento supervisionado recupera mais coautores futuros (significativo).</w:t>
+        <w:t xml:space="preserve">Texto completo (introdução/conclusão), não só o abstract.</w:t>
       </w:r>
     </w:p>
     <w:p>
@@ -2958,14 +4862,7 @@
         </w:numPr>
       </w:pPr>
       <w:r>
-        <w:rPr>
-          <w:b/>
-          <w:bCs/>
-        </w:rPr>
-        <w:t xml:space="preserve">O gargalo é a geração de candidatos: </w:t>
-      </w:r>
-      <w:r>
-        <w:t xml:space="preserve">fundir FONTES de candidatos (estrutura ∪ texto) empata/melhora o RF; fundir representações (GNN, end-to-end) ou enriquecer com categorias GenAI, não.</w:t>
+        <w:t xml:space="preserve">Referências como texto (títulos citados, contexto de citação).</w:t>
       </w:r>
     </w:p>
     <w:p>
@@ -2977,14 +4874,7 @@
         </w:numPr>
       </w:pPr>
       <w:r>
-        <w:rPr>
-          <w:b/>
-          <w:bCs/>
-        </w:rPr>
-        <w:t xml:space="preserve">Cold-start resolvido pelo texto (avanço central): </w:t>
-      </w:r>
-      <w:r>
-        <w:t xml:space="preserve">onde a topologia falha por construção (0% de recall), a semântica textual é a única fonte de sinal — confirmando a hipótese da tese exatamente onde é decisiva.</w:t>
+        <w:t xml:space="preserve">Perfil textual agregado do autor e conceitos/venue como texto.</w:t>
       </w:r>
     </w:p>
     <w:p>
@@ -2996,34 +4886,7 @@
         </w:numPr>
       </w:pPr>
       <w:r>
-        <w:rPr>
-          <w:b/>
-          <w:bCs/>
-        </w:rPr>
-        <w:t xml:space="preserve">Complementaridade caracterizada: </w:t>
-      </w:r>
-      <w:r>
-        <w:t xml:space="preserve">topologia domina autores bem conectados (warm) e o topo do ranking; texto domina baixa/nenhuma conectividade (cool/cold).</w:t>
-      </w:r>
-    </w:p>
-    <w:p>
-      <w:pPr>
-        <w:pStyle w:val="Heading1"/>
-      </w:pPr>
-      <w:r>
-        <w:t xml:space="preserve">7. Conclusão e próximos passos</w:t>
-      </w:r>
-    </w:p>
-    <w:p>
-      <w:r>
-        <w:rPr>
-          <w:b/>
-          <w:bCs/>
-        </w:rPr>
-        <w:t xml:space="preserve">Conclusão: </w:t>
-      </w:r>
-      <w:r>
-        <w:t xml:space="preserve">o baseline topológico e o Híbrido RF são fortes para pesquisadores bem conectados, mas insuficientes (cool) ou nulos (cold) no cold-start; é aí que o multimodal/textual é essencial e estatisticamente comprovado. A contribuição da tese é caracterizar onde cada fonte de informação importa e mostrar que a fusão útil é de fontes de candidatos.</w:t>
+        <w:t xml:space="preserve">Ponderação temporal dos abstracts (deriva de interesse).</w:t>
       </w:r>
     </w:p>
     <w:p>
@@ -3035,7 +4898,16 @@
         </w:numPr>
       </w:pPr>
       <w:r>
-        <w:t xml:space="preserve">Rodar o pipeline completo (GNN + fusão) na base de IA para confirmar o quadro com todos os modelos.</w:t>
+        <w:t xml:space="preserve">Fine-tuning contrastivo do encoder em pares de coautoria; SPECTER2 (citation-informed).</w:t>
+      </w:r>
+    </w:p>
+    <w:p>
+      <w:r>
+        <w:rPr>
+          <w:b/>
+          <w:bCs/>
+        </w:rPr>
+        <w:t xml:space="preserve">Combinações promissoras: </w:t>
       </w:r>
     </w:p>
     <w:p>
@@ -3047,7 +4919,7 @@
         </w:numPr>
       </w:pPr>
       <w:r>
-        <w:t xml:space="preserve">Ranqueador que preserve a precisão do RF no topo sobre o pool de candidatos ampliado.</w:t>
+        <w:t xml:space="preserve">Duas etapas: texto gera candidatos (recall) → RF reranqueia a união (precisão no topo).</w:t>
       </w:r>
     </w:p>
     <w:p>
@@ -3059,7 +4931,112 @@
         </w:numPr>
       </w:pPr>
       <w:r>
-        <w:t xml:space="preserve">Recalibrar o gate de qualidade para coletas temáticas (mean_coauthor_weight menor).</w:t>
+        <w:t xml:space="preserve">Learning-to-rank (LightGBM/LambdaMART) sobre o pool híbrido com features calibradas.</w:t>
+      </w:r>
+    </w:p>
+    <w:p>
+      <w:pPr>
+        <w:pStyle w:val="ListParagraph"/>
+        <w:numPr>
+          <w:ilvl w:val="0"/>
+          <w:numId w:val="3"/>
+        </w:numPr>
+      </w:pPr>
+      <w:r>
+        <w:t xml:space="preserve">Score fusion ponderado por regime (peso do texto ↑ em cool/cold).</w:t>
+      </w:r>
+    </w:p>
+    <w:p>
+      <w:pPr>
+        <w:pStyle w:val="ListParagraph"/>
+        <w:numPr>
+          <w:ilvl w:val="0"/>
+          <w:numId w:val="3"/>
+        </w:numPr>
+      </w:pPr>
+      <w:r>
+        <w:t xml:space="preserve">Encoder fine-tuned combinado às estratégias acima.</w:t>
+      </w:r>
+    </w:p>
+    <w:p>
+      <w:pPr>
+        <w:pStyle w:val="Heading1"/>
+      </w:pPr>
+      <w:r>
+        <w:t xml:space="preserve">11. Caminhos futuros (sequência pós-trabalho)</w:t>
+      </w:r>
+    </w:p>
+    <w:p>
+      <w:pPr>
+        <w:pStyle w:val="ListParagraph"/>
+        <w:numPr>
+          <w:ilvl w:val="0"/>
+          <w:numId w:val="2"/>
+        </w:numPr>
+      </w:pPr>
+      <w:r>
+        <w:t xml:space="preserve">Reranker de duas etapas (texto-recall → topologia-precisão) — o avanço mais provável sobre o RF.</w:t>
+      </w:r>
+    </w:p>
+    <w:p>
+      <w:pPr>
+        <w:pStyle w:val="ListParagraph"/>
+        <w:numPr>
+          <w:ilvl w:val="0"/>
+          <w:numId w:val="2"/>
+        </w:numPr>
+      </w:pPr>
+      <w:r>
+        <w:t xml:space="preserve">Fine-tuning do encoder científico e ablação dos sinais textuais.</w:t>
+      </w:r>
+    </w:p>
+    <w:p>
+      <w:pPr>
+        <w:pStyle w:val="ListParagraph"/>
+        <w:numPr>
+          <w:ilvl w:val="0"/>
+          <w:numId w:val="2"/>
+        </w:numPr>
+      </w:pPr>
+      <w:r>
+        <w:t xml:space="preserve">Estudo de generalização multi-domínio (denso × esparso) e curva densidade × ganho do texto.</w:t>
+      </w:r>
+    </w:p>
+    <w:p>
+      <w:pPr>
+        <w:pStyle w:val="ListParagraph"/>
+        <w:numPr>
+          <w:ilvl w:val="0"/>
+          <w:numId w:val="2"/>
+        </w:numPr>
+      </w:pPr>
+      <w:r>
+        <w:t xml:space="preserve">Recomendação explicável (por que este coautor?) usando os sinais textuais.</w:t>
+      </w:r>
+    </w:p>
+    <w:p>
+      <w:pPr>
+        <w:pStyle w:val="ListParagraph"/>
+        <w:numPr>
+          <w:ilvl w:val="0"/>
+          <w:numId w:val="2"/>
+        </w:numPr>
+      </w:pPr>
+      <w:r>
+        <w:t xml:space="preserve">Artigos: (a) cold-start de coautoria com semântica; (b) o gargalo de candidatos em redes esparsas.</w:t>
+      </w:r>
+    </w:p>
+    <w:p>
+      <w:pPr>
+        <w:pStyle w:val="Heading1"/>
+      </w:pPr>
+      <w:r>
+        <w:t xml:space="preserve">12. Conclusão</w:t>
+      </w:r>
+    </w:p>
+    <w:p>
+      <w:r>
+        <w:t xml:space="preserve">O trabalho caracteriza, com rigor estatístico e em dois domínios contrastantes, onde cada fonte de informação importa na recomendação de coautoria. A estrutura domina autores bem conectados e o topo do ranking; a semântica textual é insubstituível quando a estrutura é esparsa ou ausente (cold-start). A contribuição central — a fusão útil é de fontes de candidatos, não de representações — reorienta o problema e abre caminhos claros de continuidade para a tese e para artigos.</w:t>
       </w:r>
     </w:p>
     <w:sectPr>
@@ -3129,7 +5106,7 @@
         <w:sz w:val="16"/>
         <w:szCs w:val="16"/>
       </w:rPr>
-      <w:t xml:space="preserve">coauthor-rec · Relatório de Avaliação · pág. </w:t>
+      <w:t xml:space="preserve">coauthor-rec · Relatório científico · pág. </w:t>
     </w:r>
     <w:r>
       <w:rPr>

</xml_diff>

<commit_message>
Integra 2-etapas (modelo vencedor) nos entregáveis + recomendação explicável
(1) final_comparison/plot_metrics/build_dashboard/gen_report_docx incluem o
reranker de 2 etapas (9 modelos). Dashboard, gráficos, TABELA_METRICAS e
RELATORIO_AVALIACAO.docx regenerados com o modelo vencedor em destaque (passo 8,
comentários, conclusão).
(2) scripts/explain.py: recomendação explicável. Ex. Ajzen→Fishbein — 0 coautores
em comum, cosseno textual 0,94, conceitos "Theory of Planned Behavior", termos
"behavior/intentions/attitudes". Mostra o mecanismo (afinidade temática) por trás
dos ganhos em cool/cold.

Co-Authored-By: Claude Opus 4.8 <noreply@anthropic.com>
</commit_message>
<xml_diff>
--- a/docs/RELATORIO_AVALIACAO.docx
+++ b/docs/RELATORIO_AVALIACAO.docx
@@ -812,6 +812,25 @@
     </w:p>
     <w:p>
       <w:pPr>
+        <w:pStyle w:val="ListParagraph"/>
+        <w:numPr>
+          <w:ilvl w:val="0"/>
+          <w:numId w:val="2"/>
+        </w:numPr>
+      </w:pPr>
+      <w:r>
+        <w:rPr>
+          <w:b/>
+          <w:bCs/>
+        </w:rPr>
+        <w:t xml:space="preserve">Reranker de 2 etapas (RF→texto) — MODELO VENCEDOR. </w:t>
+      </w:r>
+      <w:r>
+        <w:t xml:space="preserve">Método: estágio 1 = 2-hop ranqueado pela RF (precisão no topo); estágio 2 = cauda de vizinhos textuais (alcance). Resultado: supera o RF significativamente em todos os K e regimes (overall R@10 +0,48pp p=1,7e-10; R@200 +3,37pp p=4,5e-66; cool R@10 +0,90pp; R@200 +3,96pp). Conclusão: une a precisão estrutural do topo ao alcance do texto — primeiro modelo a dominar em todas as faixas.</w:t>
+      </w:r>
+    </w:p>
+    <w:p>
+      <w:pPr>
         <w:pStyle w:val="Heading1"/>
       </w:pPr>
       <w:r>
@@ -2191,7 +2210,7 @@
                 <w:sz w:val="18"/>
                 <w:szCs w:val="18"/>
               </w:rPr>
-              <w:t xml:space="preserve">Oráculo (teto)</w:t>
+              <w:t xml:space="preserve">2 etapas (RF→texto)</w:t>
             </w:r>
           </w:p>
         </w:tc>
@@ -2224,7 +2243,7 @@
                 <w:sz w:val="18"/>
                 <w:szCs w:val="18"/>
               </w:rPr>
-              <w:t xml:space="preserve">6.31</w:t>
+              <w:t xml:space="preserve">7.10</w:t>
             </w:r>
           </w:p>
         </w:tc>
@@ -2237,7 +2256,7 @@
               <w:bottom w:val="single" w:color="BBBBBB" w:sz="1"/>
               <w:right w:val="single" w:color="BBBBBB" w:sz="1"/>
             </w:tcBorders>
-            <w:shd w:fill="EEF3F8" w:val="clear"/>
+            <w:shd w:fill="DDEBD8" w:val="clear"/>
             <w:tcMar>
               <w:top w:type="dxa" w:w="60"/>
               <w:left w:type="dxa" w:w="90"/>
@@ -2257,7 +2276,7 @@
                 <w:sz w:val="18"/>
                 <w:szCs w:val="18"/>
               </w:rPr>
-              <w:t xml:space="preserve">+5.02</w:t>
+              <w:t xml:space="preserve">+5.81</w:t>
             </w:r>
           </w:p>
         </w:tc>
@@ -2290,6 +2309,169 @@
                 <w:sz w:val="18"/>
                 <w:szCs w:val="18"/>
               </w:rPr>
+              <w:t xml:space="preserve">4.98</w:t>
+            </w:r>
+          </w:p>
+        </w:tc>
+        <w:tc>
+          <w:tcPr>
+            <w:tcW w:type="dxa" w:w="1580"/>
+            <w:tcBorders>
+              <w:top w:val="single" w:color="BBBBBB" w:sz="1"/>
+              <w:left w:val="single" w:color="BBBBBB" w:sz="1"/>
+              <w:bottom w:val="single" w:color="BBBBBB" w:sz="1"/>
+              <w:right w:val="single" w:color="BBBBBB" w:sz="1"/>
+            </w:tcBorders>
+            <w:shd w:fill="EEF3F8" w:val="clear"/>
+            <w:tcMar>
+              <w:top w:type="dxa" w:w="60"/>
+              <w:left w:type="dxa" w:w="90"/>
+              <w:bottom w:type="dxa" w:w="60"/>
+              <w:right w:type="dxa" w:w="90"/>
+            </w:tcMar>
+            <w:vAlign w:val="center"/>
+          </w:tcPr>
+          <w:p>
+            <w:pPr>
+              <w:jc w:val="right"/>
+            </w:pPr>
+            <w:r>
+              <w:rPr>
+                <w:b w:val="false"/>
+                <w:bCs w:val="false"/>
+                <w:sz w:val="18"/>
+                <w:szCs w:val="18"/>
+              </w:rPr>
+              <w:t xml:space="preserve">2.68</w:t>
+            </w:r>
+          </w:p>
+        </w:tc>
+      </w:tr>
+      <w:tr>
+        <w:tc>
+          <w:tcPr>
+            <w:tcW w:type="dxa" w:w="3200"/>
+            <w:tcBorders>
+              <w:top w:val="single" w:color="BBBBBB" w:sz="1"/>
+              <w:left w:val="single" w:color="BBBBBB" w:sz="1"/>
+              <w:bottom w:val="single" w:color="BBBBBB" w:sz="1"/>
+              <w:right w:val="single" w:color="BBBBBB" w:sz="1"/>
+            </w:tcBorders>
+            <w:tcMar>
+              <w:top w:type="dxa" w:w="60"/>
+              <w:left w:type="dxa" w:w="90"/>
+              <w:bottom w:type="dxa" w:w="60"/>
+              <w:right w:type="dxa" w:w="90"/>
+            </w:tcMar>
+            <w:vAlign w:val="center"/>
+          </w:tcPr>
+          <w:p>
+            <w:pPr>
+              <w:jc w:val="left"/>
+            </w:pPr>
+            <w:r>
+              <w:rPr>
+                <w:b w:val="false"/>
+                <w:bCs w:val="false"/>
+                <w:sz w:val="18"/>
+                <w:szCs w:val="18"/>
+              </w:rPr>
+              <w:t xml:space="preserve">Oráculo (teto)</w:t>
+            </w:r>
+          </w:p>
+        </w:tc>
+        <w:tc>
+          <w:tcPr>
+            <w:tcW w:type="dxa" w:w="1500"/>
+            <w:tcBorders>
+              <w:top w:val="single" w:color="BBBBBB" w:sz="1"/>
+              <w:left w:val="single" w:color="BBBBBB" w:sz="1"/>
+              <w:bottom w:val="single" w:color="BBBBBB" w:sz="1"/>
+              <w:right w:val="single" w:color="BBBBBB" w:sz="1"/>
+            </w:tcBorders>
+            <w:tcMar>
+              <w:top w:type="dxa" w:w="60"/>
+              <w:left w:type="dxa" w:w="90"/>
+              <w:bottom w:type="dxa" w:w="60"/>
+              <w:right w:type="dxa" w:w="90"/>
+            </w:tcMar>
+            <w:vAlign w:val="center"/>
+          </w:tcPr>
+          <w:p>
+            <w:pPr>
+              <w:jc w:val="right"/>
+            </w:pPr>
+            <w:r>
+              <w:rPr>
+                <w:b w:val="false"/>
+                <w:bCs w:val="false"/>
+                <w:sz w:val="18"/>
+                <w:szCs w:val="18"/>
+              </w:rPr>
+              <w:t xml:space="preserve">6.31</w:t>
+            </w:r>
+          </w:p>
+        </w:tc>
+        <w:tc>
+          <w:tcPr>
+            <w:tcW w:type="dxa" w:w="1500"/>
+            <w:tcBorders>
+              <w:top w:val="single" w:color="BBBBBB" w:sz="1"/>
+              <w:left w:val="single" w:color="BBBBBB" w:sz="1"/>
+              <w:bottom w:val="single" w:color="BBBBBB" w:sz="1"/>
+              <w:right w:val="single" w:color="BBBBBB" w:sz="1"/>
+            </w:tcBorders>
+            <w:tcMar>
+              <w:top w:type="dxa" w:w="60"/>
+              <w:left w:type="dxa" w:w="90"/>
+              <w:bottom w:type="dxa" w:w="60"/>
+              <w:right w:type="dxa" w:w="90"/>
+            </w:tcMar>
+            <w:vAlign w:val="center"/>
+          </w:tcPr>
+          <w:p>
+            <w:pPr>
+              <w:jc w:val="right"/>
+            </w:pPr>
+            <w:r>
+              <w:rPr>
+                <w:b/>
+                <w:bCs/>
+                <w:sz w:val="18"/>
+                <w:szCs w:val="18"/>
+              </w:rPr>
+              <w:t xml:space="preserve">+5.02</w:t>
+            </w:r>
+          </w:p>
+        </w:tc>
+        <w:tc>
+          <w:tcPr>
+            <w:tcW w:type="dxa" w:w="1580"/>
+            <w:tcBorders>
+              <w:top w:val="single" w:color="BBBBBB" w:sz="1"/>
+              <w:left w:val="single" w:color="BBBBBB" w:sz="1"/>
+              <w:bottom w:val="single" w:color="BBBBBB" w:sz="1"/>
+              <w:right w:val="single" w:color="BBBBBB" w:sz="1"/>
+            </w:tcBorders>
+            <w:tcMar>
+              <w:top w:type="dxa" w:w="60"/>
+              <w:left w:type="dxa" w:w="90"/>
+              <w:bottom w:type="dxa" w:w="60"/>
+              <w:right w:type="dxa" w:w="90"/>
+            </w:tcMar>
+            <w:vAlign w:val="center"/>
+          </w:tcPr>
+          <w:p>
+            <w:pPr>
+              <w:jc w:val="right"/>
+            </w:pPr>
+            <w:r>
+              <w:rPr>
+                <w:b w:val="false"/>
+                <w:bCs w:val="false"/>
+                <w:sz w:val="18"/>
+                <w:szCs w:val="18"/>
+              </w:rPr>
               <w:t xml:space="preserve">31.40</w:t>
             </w:r>
           </w:p>
@@ -2303,7 +2485,6 @@
               <w:bottom w:val="single" w:color="BBBBBB" w:sz="1"/>
               <w:right w:val="single" w:color="BBBBBB" w:sz="1"/>
             </w:tcBorders>
-            <w:shd w:fill="EEF3F8" w:val="clear"/>
             <w:tcMar>
               <w:top w:type="dxa" w:w="60"/>
               <w:left w:type="dxa" w:w="90"/>
@@ -5036,7 +5217,7 @@
     </w:p>
     <w:p>
       <w:r>
-        <w:t xml:space="preserve">O trabalho caracteriza, com rigor estatístico e em dois domínios contrastantes, onde cada fonte de informação importa na recomendação de coautoria. A estrutura domina autores bem conectados e o topo do ranking; a semântica textual é insubstituível quando a estrutura é esparsa ou ausente (cold-start). A contribuição central — a fusão útil é de fontes de candidatos, não de representações — reorienta o problema e abre caminhos claros de continuidade para a tese e para artigos.</w:t>
+        <w:t xml:space="preserve">O trabalho caracteriza, com rigor estatístico e em dois domínios contrastantes, onde cada fonte de informação importa na recomendação de coautoria. A estrutura domina autores bem conectados e o topo do ranking; a semântica textual é insubstituível quando a estrutura é esparsa ou ausente (cold-start). A contribuição central — a fusão útil é de fontes de candidatos, não de representações — reorienta o problema. Materializa-se num modelo operacional vencedor, o reranker de duas etapas (RF→texto), que supera todas as abordagens isoladas em todas as faixas de K e regimes, unindo a precisão estrutural do topo ao alcance textual. Os achados abrem caminhos claros de continuidade para a tese e para artigos.</w:t>
       </w:r>
     </w:p>
     <w:sectPr>

</xml_diff>